<commit_message>
Add bold_skills.py and apply inline skill bolding + fix bad chars
bold_skills.py:
- Skills section: category key bold, values normal
- Summary + all 5 job sections: tech tool names bolded inline
- Extracts terms from skills section + curated EXTRA_TERMS list

Also fixed formatting in base_resume.docx and output resume:
- Removed U+2011 non-breaking hyphens -> regular hyphens
- Removed U+202C Pop Directional Formatting control char
- Fixed curly apostrophes to straight

Co-Authored-By: Claude Sonnet 4.6 <noreply@anthropic.com>
</commit_message>
<xml_diff>
--- a/resume/Revathi_Battina_Resume.docx
+++ b/resume/Revathi_Battina_Resume.docx
@@ -99,7 +99,6 @@
         <w:rPr>
           <w:rFonts w:ascii="Calibri" w:eastAsia="Calibri" w:hAnsi="Calibri" w:cs="Calibri"/>
         </w:rPr>
-        <w:t>‬</w:t>
       </w:r>
     </w:p>
     <w:p>
@@ -236,11 +235,51 @@
       </w:pPr>
       <w:r>
         <w:rPr>
-          <w:rFonts w:ascii="Calibri" w:hAnsi="Calibri" w:cs="Calibri"/>
-          <w:sz w:val="22"/>
-          <w:szCs w:val="22"/>
-        </w:rPr>
-        <w:t>Playwright, Cypress, and Selenium WebDriver are my primary UI automation tools; I've built production frameworks in all three and know where each one breaks down.</w:t>
+          <w:rFonts w:ascii="Calibri" w:hAnsi="Calibri"/>
+          <w:b/>
+          <w:sz w:val="22"/>
+        </w:rPr>
+        <w:t>Playwright</w:t>
+      </w:r>
+      <w:r>
+        <w:rPr>
+          <w:rFonts w:ascii="Calibri" w:hAnsi="Calibri"/>
+          <w:b w:val="0"/>
+          <w:sz w:val="22"/>
+        </w:rPr>
+        <w:t xml:space="preserve">, </w:t>
+      </w:r>
+      <w:r>
+        <w:rPr>
+          <w:rFonts w:ascii="Calibri" w:hAnsi="Calibri"/>
+          <w:b/>
+          <w:sz w:val="22"/>
+        </w:rPr>
+        <w:t>Cypress</w:t>
+      </w:r>
+      <w:r>
+        <w:rPr>
+          <w:rFonts w:ascii="Calibri" w:hAnsi="Calibri"/>
+          <w:b w:val="0"/>
+          <w:sz w:val="22"/>
+        </w:rPr>
+        <w:t xml:space="preserve">, and </w:t>
+      </w:r>
+      <w:r>
+        <w:rPr>
+          <w:rFonts w:ascii="Calibri" w:hAnsi="Calibri"/>
+          <w:b/>
+          <w:sz w:val="22"/>
+        </w:rPr>
+        <w:t>Selenium WebDriver</w:t>
+      </w:r>
+      <w:r>
+        <w:rPr>
+          <w:rFonts w:ascii="Calibri" w:hAnsi="Calibri"/>
+          <w:b w:val="0"/>
+          <w:sz w:val="22"/>
+        </w:rPr>
+        <w:t xml:space="preserve"> are my primary UI automation tools; I've built production frameworks in all three and know where each one breaks down.</w:t>
       </w:r>
     </w:p>
     <w:p>
@@ -258,11 +297,377 @@
       </w:pPr>
       <w:r>
         <w:rPr>
-          <w:rFonts w:ascii="Calibri" w:hAnsi="Calibri" w:cs="Calibri"/>
-          <w:sz w:val="22"/>
-          <w:szCs w:val="22"/>
-        </w:rPr>
-        <w:t>API quality is non-negotiable on my teams — REST Assured contract tests, Karate data-driven suites, and Postman collection runs are baked into every pipeline I own.</w:t>
+          <w:rFonts w:ascii="Calibri" w:hAnsi="Calibri"/>
+          <w:b w:val="0"/>
+          <w:sz w:val="22"/>
+        </w:rPr>
+        <w:t xml:space="preserve">API quality is non-negotiable on my teams — </w:t>
+      </w:r>
+      <w:r>
+        <w:rPr>
+          <w:rFonts w:ascii="Calibri" w:hAnsi="Calibri"/>
+          <w:b/>
+          <w:sz w:val="22"/>
+        </w:rPr>
+        <w:t>REST Assured</w:t>
+      </w:r>
+      <w:r>
+        <w:rPr>
+          <w:rFonts w:ascii="Calibri" w:hAnsi="Calibri"/>
+          <w:b w:val="0"/>
+          <w:sz w:val="22"/>
+        </w:rPr>
+        <w:t xml:space="preserve"> contract tests, </w:t>
+      </w:r>
+      <w:r>
+        <w:rPr>
+          <w:rFonts w:ascii="Calibri" w:hAnsi="Calibri"/>
+          <w:b/>
+          <w:sz w:val="22"/>
+        </w:rPr>
+        <w:t>Karate</w:t>
+      </w:r>
+      <w:r>
+        <w:rPr>
+          <w:rFonts w:ascii="Calibri" w:hAnsi="Calibri"/>
+          <w:b w:val="0"/>
+          <w:sz w:val="22"/>
+        </w:rPr>
+        <w:t xml:space="preserve"> data-driven suites, and </w:t>
+      </w:r>
+      <w:r>
+        <w:rPr>
+          <w:rFonts w:ascii="Calibri" w:hAnsi="Calibri"/>
+          <w:b/>
+          <w:sz w:val="22"/>
+        </w:rPr>
+        <w:t>Postman</w:t>
+      </w:r>
+      <w:r>
+        <w:rPr>
+          <w:rFonts w:ascii="Calibri" w:hAnsi="Calibri"/>
+          <w:b w:val="0"/>
+          <w:sz w:val="22"/>
+        </w:rPr>
+        <w:t xml:space="preserve"> collection runs are baked into every pipeline I own.</w:t>
+      </w:r>
+    </w:p>
+    <w:p>
+      <w:pPr>
+        <w:pStyle w:val="NoSpacing"/>
+        <w:numPr>
+          <w:ilvl w:val="0"/>
+          <w:numId w:val="1"/>
+        </w:numPr>
+        <w:rPr>
+          <w:rFonts w:ascii="Calibri" w:hAnsi="Calibri" w:cs="Calibri"/>
+          <w:sz w:val="22"/>
+          <w:szCs w:val="22"/>
+        </w:rPr>
+      </w:pPr>
+      <w:r>
+        <w:rPr>
+          <w:rFonts w:ascii="Calibri" w:hAnsi="Calibri"/>
+          <w:b w:val="0"/>
+          <w:sz w:val="22"/>
+        </w:rPr>
+        <w:t xml:space="preserve">Cloud-native testing is a core competency: I've validated </w:t>
+      </w:r>
+      <w:r>
+        <w:rPr>
+          <w:rFonts w:ascii="Calibri" w:hAnsi="Calibri"/>
+          <w:b/>
+          <w:sz w:val="22"/>
+        </w:rPr>
+        <w:t>AWS Lambda</w:t>
+      </w:r>
+      <w:r>
+        <w:rPr>
+          <w:rFonts w:ascii="Calibri" w:hAnsi="Calibri"/>
+          <w:b w:val="0"/>
+          <w:sz w:val="22"/>
+        </w:rPr>
+        <w:t xml:space="preserve"> </w:t>
+      </w:r>
+      <w:r>
+        <w:rPr>
+          <w:rFonts w:ascii="Calibri" w:hAnsi="Calibri"/>
+          <w:b/>
+          <w:sz w:val="22"/>
+        </w:rPr>
+        <w:t>functions</w:t>
+      </w:r>
+      <w:r>
+        <w:rPr>
+          <w:rFonts w:ascii="Calibri" w:hAnsi="Calibri"/>
+          <w:b w:val="0"/>
+          <w:sz w:val="22"/>
+        </w:rPr>
+        <w:t xml:space="preserve">, </w:t>
+      </w:r>
+      <w:r>
+        <w:rPr>
+          <w:rFonts w:ascii="Calibri" w:hAnsi="Calibri"/>
+          <w:b/>
+          <w:sz w:val="22"/>
+        </w:rPr>
+        <w:t>API Gateway</w:t>
+      </w:r>
+      <w:r>
+        <w:rPr>
+          <w:rFonts w:ascii="Calibri" w:hAnsi="Calibri"/>
+          <w:b w:val="0"/>
+          <w:sz w:val="22"/>
+        </w:rPr>
+        <w:t xml:space="preserve"> contracts, </w:t>
+      </w:r>
+      <w:r>
+        <w:rPr>
+          <w:rFonts w:ascii="Calibri" w:hAnsi="Calibri"/>
+          <w:b/>
+          <w:sz w:val="22"/>
+        </w:rPr>
+        <w:t>S3</w:t>
+      </w:r>
+      <w:r>
+        <w:rPr>
+          <w:rFonts w:ascii="Calibri" w:hAnsi="Calibri"/>
+          <w:b w:val="0"/>
+          <w:sz w:val="22"/>
+        </w:rPr>
+        <w:t xml:space="preserve"> data pipelines, and containerized </w:t>
+      </w:r>
+      <w:r>
+        <w:rPr>
+          <w:rFonts w:ascii="Calibri" w:hAnsi="Calibri"/>
+          <w:b/>
+          <w:sz w:val="22"/>
+        </w:rPr>
+        <w:t>Kubernetes</w:t>
+      </w:r>
+      <w:r>
+        <w:rPr>
+          <w:rFonts w:ascii="Calibri" w:hAnsi="Calibri"/>
+          <w:b w:val="0"/>
+          <w:sz w:val="22"/>
+        </w:rPr>
+        <w:t xml:space="preserve"> workloads in production </w:t>
+      </w:r>
+      <w:r>
+        <w:rPr>
+          <w:rFonts w:ascii="Calibri" w:hAnsi="Calibri"/>
+          <w:b/>
+          <w:sz w:val="22"/>
+        </w:rPr>
+        <w:t>CI/CD</w:t>
+      </w:r>
+      <w:r>
+        <w:rPr>
+          <w:rFonts w:ascii="Calibri" w:hAnsi="Calibri"/>
+          <w:b w:val="0"/>
+          <w:sz w:val="22"/>
+        </w:rPr>
+        <w:t xml:space="preserve"> flows.</w:t>
+      </w:r>
+    </w:p>
+    <w:p>
+      <w:pPr>
+        <w:pStyle w:val="NoSpacing"/>
+        <w:numPr>
+          <w:ilvl w:val="0"/>
+          <w:numId w:val="1"/>
+        </w:numPr>
+        <w:rPr>
+          <w:rFonts w:ascii="Calibri" w:hAnsi="Calibri" w:cs="Calibri"/>
+          <w:sz w:val="22"/>
+          <w:szCs w:val="22"/>
+        </w:rPr>
+      </w:pPr>
+      <w:r>
+        <w:rPr>
+          <w:rFonts w:ascii="Calibri" w:hAnsi="Calibri"/>
+          <w:b w:val="0"/>
+          <w:sz w:val="22"/>
+        </w:rPr>
+        <w:t xml:space="preserve">AI-assisted QA is already in my daily workflow — </w:t>
+      </w:r>
+      <w:r>
+        <w:rPr>
+          <w:rFonts w:ascii="Calibri" w:hAnsi="Calibri"/>
+          <w:b/>
+          <w:sz w:val="22"/>
+        </w:rPr>
+        <w:t>GitHub Copilot</w:t>
+      </w:r>
+      <w:r>
+        <w:rPr>
+          <w:rFonts w:ascii="Calibri" w:hAnsi="Calibri"/>
+          <w:b w:val="0"/>
+          <w:sz w:val="22"/>
+        </w:rPr>
+        <w:t xml:space="preserve"> and </w:t>
+      </w:r>
+      <w:r>
+        <w:rPr>
+          <w:rFonts w:ascii="Calibri" w:hAnsi="Calibri"/>
+          <w:b/>
+          <w:sz w:val="22"/>
+        </w:rPr>
+        <w:t>Claude</w:t>
+      </w:r>
+      <w:r>
+        <w:rPr>
+          <w:rFonts w:ascii="Calibri" w:hAnsi="Calibri"/>
+          <w:b w:val="0"/>
+          <w:sz w:val="22"/>
+        </w:rPr>
+        <w:t xml:space="preserve"> cut my boilerplate coding by roughly 35%, and self-healing locators reduced flaky overnight runs by 40%.</w:t>
+      </w:r>
+    </w:p>
+    <w:p>
+      <w:pPr>
+        <w:pStyle w:val="NoSpacing"/>
+        <w:numPr>
+          <w:ilvl w:val="0"/>
+          <w:numId w:val="1"/>
+        </w:numPr>
+        <w:rPr>
+          <w:rFonts w:ascii="Calibri" w:hAnsi="Calibri" w:cs="Calibri"/>
+          <w:sz w:val="22"/>
+          <w:szCs w:val="22"/>
+        </w:rPr>
+      </w:pPr>
+      <w:r>
+        <w:rPr>
+          <w:rFonts w:ascii="Calibri" w:hAnsi="Calibri"/>
+          <w:b w:val="0"/>
+          <w:sz w:val="22"/>
+        </w:rPr>
+        <w:t xml:space="preserve">Performance testing with </w:t>
+      </w:r>
+      <w:r>
+        <w:rPr>
+          <w:rFonts w:ascii="Calibri" w:hAnsi="Calibri"/>
+          <w:b/>
+          <w:sz w:val="22"/>
+        </w:rPr>
+        <w:t>JMeter</w:t>
+      </w:r>
+      <w:r>
+        <w:rPr>
+          <w:rFonts w:ascii="Calibri" w:hAnsi="Calibri"/>
+          <w:b w:val="0"/>
+          <w:sz w:val="22"/>
+        </w:rPr>
+        <w:t xml:space="preserve"> and </w:t>
+      </w:r>
+      <w:r>
+        <w:rPr>
+          <w:rFonts w:ascii="Calibri" w:hAnsi="Calibri"/>
+          <w:b/>
+          <w:sz w:val="22"/>
+        </w:rPr>
+        <w:t>LoadRunner</w:t>
+      </w:r>
+      <w:r>
+        <w:rPr>
+          <w:rFonts w:ascii="Calibri" w:hAnsi="Calibri"/>
+          <w:b w:val="0"/>
+          <w:sz w:val="22"/>
+        </w:rPr>
+        <w:t xml:space="preserve"> is something I do hands-on, not delegated — I've identified specific throughput bottlenecks and handed developers data they could act on the same sprint.</w:t>
+      </w:r>
+    </w:p>
+    <w:p>
+      <w:pPr>
+        <w:pStyle w:val="NoSpacing"/>
+        <w:numPr>
+          <w:ilvl w:val="0"/>
+          <w:numId w:val="1"/>
+        </w:numPr>
+        <w:rPr>
+          <w:rFonts w:ascii="Calibri" w:hAnsi="Calibri" w:cs="Calibri"/>
+          <w:sz w:val="22"/>
+          <w:szCs w:val="22"/>
+        </w:rPr>
+      </w:pPr>
+      <w:r>
+        <w:rPr>
+          <w:rFonts w:ascii="Calibri" w:hAnsi="Calibri"/>
+          <w:b w:val="0"/>
+          <w:sz w:val="22"/>
+        </w:rPr>
+        <w:t xml:space="preserve">Mobile automation across iOS and Android using </w:t>
+      </w:r>
+      <w:r>
+        <w:rPr>
+          <w:rFonts w:ascii="Calibri" w:hAnsi="Calibri"/>
+          <w:b/>
+          <w:sz w:val="22"/>
+        </w:rPr>
+        <w:t>Appium</w:t>
+      </w:r>
+      <w:r>
+        <w:rPr>
+          <w:rFonts w:ascii="Calibri" w:hAnsi="Calibri"/>
+          <w:b w:val="0"/>
+          <w:sz w:val="22"/>
+        </w:rPr>
+        <w:t xml:space="preserve">, </w:t>
+      </w:r>
+      <w:r>
+        <w:rPr>
+          <w:rFonts w:ascii="Calibri" w:hAnsi="Calibri"/>
+          <w:b/>
+          <w:sz w:val="22"/>
+        </w:rPr>
+        <w:t>Espresso</w:t>
+      </w:r>
+      <w:r>
+        <w:rPr>
+          <w:rFonts w:ascii="Calibri" w:hAnsi="Calibri"/>
+          <w:b w:val="0"/>
+          <w:sz w:val="22"/>
+        </w:rPr>
+        <w:t xml:space="preserve">, and </w:t>
+      </w:r>
+      <w:r>
+        <w:rPr>
+          <w:rFonts w:ascii="Calibri" w:hAnsi="Calibri"/>
+          <w:b/>
+          <w:sz w:val="22"/>
+        </w:rPr>
+        <w:t>XCUITest</w:t>
+      </w:r>
+      <w:r>
+        <w:rPr>
+          <w:rFonts w:ascii="Calibri" w:hAnsi="Calibri"/>
+          <w:b w:val="0"/>
+          <w:sz w:val="22"/>
+        </w:rPr>
+        <w:t xml:space="preserve"> is part of my delivery toolkit, validated against enterprise device farms and TestFlight beta pipelines.</w:t>
+      </w:r>
+    </w:p>
+    <w:p>
+      <w:pPr>
+        <w:pStyle w:val="NoSpacing"/>
+        <w:numPr>
+          <w:ilvl w:val="0"/>
+          <w:numId w:val="1"/>
+        </w:numPr>
+        <w:rPr>
+          <w:rFonts w:ascii="Calibri" w:hAnsi="Calibri" w:cs="Calibri"/>
+          <w:sz w:val="22"/>
+          <w:szCs w:val="22"/>
+        </w:rPr>
+      </w:pPr>
+      <w:r>
+        <w:rPr>
+          <w:rFonts w:ascii="Calibri" w:hAnsi="Calibri" w:cs="Calibri"/>
+          <w:sz w:val="22"/>
+          <w:szCs w:val="22"/>
+        </w:rPr>
+        <w:t>Led and mentored QA teams across Equifax, UST Global, and Availity — running code reviews, owning hiring decisions, and building cultures where engineers felt ownership over quality.</w:t>
       </w:r>
       <w:r>
         <w:rPr>
@@ -278,6 +683,20 @@
           <w:szCs w:val="22"/>
         </w:rPr>
       </w:r>
+      <w:r>
+        <w:rPr>
+          <w:rFonts w:ascii="Cambria Math" w:hAnsi="Cambria Math" w:cs="Cambria Math"/>
+          <w:sz w:val="22"/>
+          <w:szCs w:val="22"/>
+        </w:rPr>
+      </w:r>
+      <w:r>
+        <w:rPr>
+          <w:rFonts w:ascii="Calibri" w:hAnsi="Calibri" w:cs="Calibri"/>
+          <w:sz w:val="22"/>
+          <w:szCs w:val="22"/>
+        </w:rPr>
+      </w:r>
     </w:p>
     <w:p>
       <w:pPr>
@@ -294,25 +713,83 @@
       </w:pPr>
       <w:r>
         <w:rPr>
-          <w:rFonts w:ascii="Calibri" w:hAnsi="Calibri" w:cs="Calibri"/>
-          <w:sz w:val="22"/>
-          <w:szCs w:val="22"/>
-        </w:rPr>
-        <w:t>Cloud-native testing is a core competency: I've validated AWS Lambda functions, API Gateway contracts, S3 data pipelines, and containerized Kubernetes workloads in production CI/CD flows.</w:t>
-      </w:r>
-      <w:r>
-        <w:rPr>
-          <w:rFonts w:ascii="Cambria Math" w:hAnsi="Cambria Math" w:cs="Cambria Math"/>
-          <w:sz w:val="22"/>
-          <w:szCs w:val="22"/>
-        </w:rPr>
-      </w:r>
-      <w:r>
-        <w:rPr>
-          <w:rFonts w:ascii="Calibri" w:hAnsi="Calibri" w:cs="Calibri"/>
-          <w:sz w:val="22"/>
-          <w:szCs w:val="22"/>
-        </w:rPr>
+          <w:rFonts w:ascii="Calibri" w:hAnsi="Calibri"/>
+          <w:b/>
+          <w:sz w:val="22"/>
+        </w:rPr>
+        <w:t>CI/CD</w:t>
+      </w:r>
+      <w:r>
+        <w:rPr>
+          <w:rFonts w:ascii="Calibri" w:hAnsi="Calibri"/>
+          <w:b w:val="0"/>
+          <w:sz w:val="22"/>
+        </w:rPr>
+        <w:t xml:space="preserve"> pipeline ownership, not just participation: </w:t>
+      </w:r>
+      <w:r>
+        <w:rPr>
+          <w:rFonts w:ascii="Calibri" w:hAnsi="Calibri"/>
+          <w:b/>
+          <w:sz w:val="22"/>
+        </w:rPr>
+        <w:t>Jenkins</w:t>
+      </w:r>
+      <w:r>
+        <w:rPr>
+          <w:rFonts w:ascii="Calibri" w:hAnsi="Calibri"/>
+          <w:b w:val="0"/>
+          <w:sz w:val="22"/>
+        </w:rPr>
+        <w:t xml:space="preserve">, </w:t>
+      </w:r>
+      <w:r>
+        <w:rPr>
+          <w:rFonts w:ascii="Calibri" w:hAnsi="Calibri"/>
+          <w:b/>
+          <w:sz w:val="22"/>
+        </w:rPr>
+        <w:t>GitHub Actions</w:t>
+      </w:r>
+      <w:r>
+        <w:rPr>
+          <w:rFonts w:ascii="Calibri" w:hAnsi="Calibri"/>
+          <w:b w:val="0"/>
+          <w:sz w:val="22"/>
+        </w:rPr>
+        <w:t xml:space="preserve">, </w:t>
+      </w:r>
+      <w:r>
+        <w:rPr>
+          <w:rFonts w:ascii="Calibri" w:hAnsi="Calibri"/>
+          <w:b/>
+          <w:sz w:val="22"/>
+        </w:rPr>
+        <w:t>GitLab CI</w:t>
+      </w:r>
+      <w:r>
+        <w:rPr>
+          <w:rFonts w:ascii="Calibri" w:hAnsi="Calibri"/>
+          <w:b w:val="0"/>
+          <w:sz w:val="22"/>
+        </w:rPr>
+        <w:t xml:space="preserve">, and </w:t>
+      </w:r>
+      <w:r>
+        <w:rPr>
+          <w:rFonts w:ascii="Calibri" w:hAnsi="Calibri"/>
+          <w:b/>
+          <w:sz w:val="22"/>
+        </w:rPr>
+        <w:t>Azure DevOps</w:t>
+      </w:r>
+      <w:r>
+        <w:rPr>
+          <w:rFonts w:ascii="Calibri" w:hAnsi="Calibri"/>
+          <w:b w:val="0"/>
+          <w:sz w:val="22"/>
+        </w:rPr>
+        <w:t xml:space="preserve"> pipelines I've built trigger regression, smoke, and contract tests automatically on every merge.</w:t>
       </w:r>
     </w:p>
     <w:p>
@@ -330,11 +807,91 @@
       </w:pPr>
       <w:r>
         <w:rPr>
-          <w:rFonts w:ascii="Calibri" w:hAnsi="Calibri" w:cs="Calibri"/>
-          <w:sz w:val="22"/>
-          <w:szCs w:val="22"/>
-        </w:rPr>
-        <w:t>AI-assisted QA is already in my daily workflow — GitHub Copilot and Claude cut my boilerplate coding by roughly 35%, and self-healing locators reduced flaky overnight runs by 40%.</w:t>
+          <w:rFonts w:ascii="Calibri" w:hAnsi="Calibri"/>
+          <w:b w:val="0"/>
+          <w:sz w:val="22"/>
+        </w:rPr>
+        <w:t xml:space="preserve">Observability tools including </w:t>
+      </w:r>
+      <w:r>
+        <w:rPr>
+          <w:rFonts w:ascii="Calibri" w:hAnsi="Calibri"/>
+          <w:b/>
+          <w:sz w:val="22"/>
+        </w:rPr>
+        <w:t>Dynatrace</w:t>
+      </w:r>
+      <w:r>
+        <w:rPr>
+          <w:rFonts w:ascii="Calibri" w:hAnsi="Calibri"/>
+          <w:b w:val="0"/>
+          <w:sz w:val="22"/>
+        </w:rPr>
+        <w:t xml:space="preserve">, </w:t>
+      </w:r>
+      <w:r>
+        <w:rPr>
+          <w:rFonts w:ascii="Calibri" w:hAnsi="Calibri"/>
+          <w:b/>
+          <w:sz w:val="22"/>
+        </w:rPr>
+        <w:t>Splunk</w:t>
+      </w:r>
+      <w:r>
+        <w:rPr>
+          <w:rFonts w:ascii="Calibri" w:hAnsi="Calibri"/>
+          <w:b w:val="0"/>
+          <w:sz w:val="22"/>
+        </w:rPr>
+        <w:t xml:space="preserve">, </w:t>
+      </w:r>
+      <w:r>
+        <w:rPr>
+          <w:rFonts w:ascii="Calibri" w:hAnsi="Calibri"/>
+          <w:b/>
+          <w:sz w:val="22"/>
+        </w:rPr>
+        <w:t>ELK Stack</w:t>
+      </w:r>
+      <w:r>
+        <w:rPr>
+          <w:rFonts w:ascii="Calibri" w:hAnsi="Calibri"/>
+          <w:b w:val="0"/>
+          <w:sz w:val="22"/>
+        </w:rPr>
+        <w:t xml:space="preserve">, and </w:t>
+      </w:r>
+      <w:r>
+        <w:rPr>
+          <w:rFonts w:ascii="Calibri" w:hAnsi="Calibri"/>
+          <w:b/>
+          <w:sz w:val="22"/>
+        </w:rPr>
+        <w:t>Prometheus</w:t>
+      </w:r>
+      <w:r>
+        <w:rPr>
+          <w:rFonts w:ascii="Calibri" w:hAnsi="Calibri"/>
+          <w:b w:val="0"/>
+          <w:sz w:val="22"/>
+        </w:rPr>
+        <w:t>-</w:t>
+      </w:r>
+      <w:r>
+        <w:rPr>
+          <w:rFonts w:ascii="Calibri" w:hAnsi="Calibri"/>
+          <w:b/>
+          <w:sz w:val="22"/>
+        </w:rPr>
+        <w:t>Grafana</w:t>
+      </w:r>
+      <w:r>
+        <w:rPr>
+          <w:rFonts w:ascii="Calibri" w:hAnsi="Calibri"/>
+          <w:b w:val="0"/>
+          <w:sz w:val="22"/>
+        </w:rPr>
+        <w:t xml:space="preserve"> dashboards help me trace failures to root cause before developers even open a ticket.</w:t>
       </w:r>
     </w:p>
     <w:p>
@@ -352,25 +909,83 @@
       </w:pPr>
       <w:r>
         <w:rPr>
-          <w:rFonts w:ascii="Calibri" w:hAnsi="Calibri" w:cs="Calibri"/>
-          <w:sz w:val="22"/>
-          <w:szCs w:val="22"/>
-        </w:rPr>
-        <w:t>Performance testing with JMeter and LoadRunner is something I do hands-on, not delegated — I've identified specific throughput bottlenecks and handed developers data they could act on the same sprint.</w:t>
-      </w:r>
-      <w:r>
-        <w:rPr>
-          <w:rFonts w:ascii="Cambria Math" w:hAnsi="Cambria Math" w:cs="Cambria Math"/>
-          <w:sz w:val="22"/>
-          <w:szCs w:val="22"/>
-        </w:rPr>
-      </w:r>
-      <w:r>
-        <w:rPr>
-          <w:rFonts w:ascii="Calibri" w:hAnsi="Calibri" w:cs="Calibri"/>
-          <w:sz w:val="22"/>
-          <w:szCs w:val="22"/>
-        </w:rPr>
+          <w:rFonts w:ascii="Calibri" w:hAnsi="Calibri"/>
+          <w:b/>
+          <w:sz w:val="22"/>
+        </w:rPr>
+        <w:t>BDD</w:t>
+      </w:r>
+      <w:r>
+        <w:rPr>
+          <w:rFonts w:ascii="Calibri" w:hAnsi="Calibri"/>
+          <w:b w:val="0"/>
+          <w:sz w:val="22"/>
+        </w:rPr>
+        <w:t xml:space="preserve"> frameworks — </w:t>
+      </w:r>
+      <w:r>
+        <w:rPr>
+          <w:rFonts w:ascii="Calibri" w:hAnsi="Calibri"/>
+          <w:b/>
+          <w:sz w:val="22"/>
+        </w:rPr>
+        <w:t>Cucumber</w:t>
+      </w:r>
+      <w:r>
+        <w:rPr>
+          <w:rFonts w:ascii="Calibri" w:hAnsi="Calibri"/>
+          <w:b w:val="0"/>
+          <w:sz w:val="22"/>
+        </w:rPr>
+        <w:t xml:space="preserve"> with </w:t>
+      </w:r>
+      <w:r>
+        <w:rPr>
+          <w:rFonts w:ascii="Calibri" w:hAnsi="Calibri"/>
+          <w:b/>
+          <w:sz w:val="22"/>
+        </w:rPr>
+        <w:t>Gherkin</w:t>
+      </w:r>
+      <w:r>
+        <w:rPr>
+          <w:rFonts w:ascii="Calibri" w:hAnsi="Calibri"/>
+          <w:b w:val="0"/>
+          <w:sz w:val="22"/>
+        </w:rPr>
+        <w:t xml:space="preserve">, </w:t>
+      </w:r>
+      <w:r>
+        <w:rPr>
+          <w:rFonts w:ascii="Calibri" w:hAnsi="Calibri"/>
+          <w:b/>
+          <w:sz w:val="22"/>
+        </w:rPr>
+        <w:t>Spock</w:t>
+      </w:r>
+      <w:r>
+        <w:rPr>
+          <w:rFonts w:ascii="Calibri" w:hAnsi="Calibri"/>
+          <w:b w:val="0"/>
+          <w:sz w:val="22"/>
+        </w:rPr>
+        <w:t xml:space="preserve">, and </w:t>
+      </w:r>
+      <w:r>
+        <w:rPr>
+          <w:rFonts w:ascii="Calibri" w:hAnsi="Calibri"/>
+          <w:b/>
+          <w:sz w:val="22"/>
+        </w:rPr>
+        <w:t>Gauge</w:t>
+      </w:r>
+      <w:r>
+        <w:rPr>
+          <w:rFonts w:ascii="Calibri" w:hAnsi="Calibri"/>
+          <w:b w:val="0"/>
+          <w:sz w:val="22"/>
+        </w:rPr>
+        <w:t xml:space="preserve"> — let me write test scenarios product owners can read and engineers can execute, closing the gap between requirements and coverage.</w:t>
       </w:r>
     </w:p>
     <w:p>
@@ -388,11 +1003,75 @@
       </w:pPr>
       <w:r>
         <w:rPr>
-          <w:rFonts w:ascii="Calibri" w:hAnsi="Calibri" w:cs="Calibri"/>
-          <w:sz w:val="22"/>
-          <w:szCs w:val="22"/>
-        </w:rPr>
-        <w:t>Mobile automation across iOS and Android using Appium, Espresso, and XCUITest is part of my delivery toolkit, validated against enterprise device farms and TestFlight beta pipelines.</w:t>
+          <w:rFonts w:ascii="Arial" w:hAnsi="Arial"/>
+          <w:b w:val="0"/>
+          <w:sz w:val="20"/>
+        </w:rPr>
+        <w:t xml:space="preserve">Database validation is part of every release I own: complex </w:t>
+      </w:r>
+      <w:r>
+        <w:rPr>
+          <w:rFonts w:ascii="Arial" w:hAnsi="Arial"/>
+          <w:b/>
+          <w:sz w:val="20"/>
+        </w:rPr>
+        <w:t>SQL</w:t>
+      </w:r>
+      <w:r>
+        <w:rPr>
+          <w:rFonts w:ascii="Arial" w:hAnsi="Arial"/>
+          <w:b w:val="0"/>
+          <w:sz w:val="20"/>
+        </w:rPr>
+        <w:t xml:space="preserve"> queries against </w:t>
+      </w:r>
+      <w:r>
+        <w:rPr>
+          <w:rFonts w:ascii="Arial" w:hAnsi="Arial"/>
+          <w:b/>
+          <w:sz w:val="20"/>
+        </w:rPr>
+        <w:t>Oracle</w:t>
+      </w:r>
+      <w:r>
+        <w:rPr>
+          <w:rFonts w:ascii="Arial" w:hAnsi="Arial"/>
+          <w:b w:val="0"/>
+          <w:sz w:val="20"/>
+        </w:rPr>
+        <w:t xml:space="preserve">, </w:t>
+      </w:r>
+      <w:r>
+        <w:rPr>
+          <w:rFonts w:ascii="Arial" w:hAnsi="Arial"/>
+          <w:b/>
+          <w:sz w:val="20"/>
+        </w:rPr>
+        <w:t>PostgreSQL</w:t>
+      </w:r>
+      <w:r>
+        <w:rPr>
+          <w:rFonts w:ascii="Arial" w:hAnsi="Arial"/>
+          <w:b w:val="0"/>
+          <w:sz w:val="20"/>
+        </w:rPr>
+        <w:t xml:space="preserve">, and </w:t>
+      </w:r>
+      <w:r>
+        <w:rPr>
+          <w:rFonts w:ascii="Arial" w:hAnsi="Arial"/>
+          <w:b/>
+          <w:sz w:val="20"/>
+        </w:rPr>
+        <w:t>MySQL</w:t>
+      </w:r>
+      <w:r>
+        <w:rPr>
+          <w:rFonts w:ascii="Arial" w:hAnsi="Arial"/>
+          <w:b w:val="0"/>
+          <w:sz w:val="20"/>
+        </w:rPr>
+        <w:t xml:space="preserve"> catch data-integrity defects that API tests routinely miss.</w:t>
       </w:r>
     </w:p>
     <w:p>
@@ -410,39 +1089,35 @@
       </w:pPr>
       <w:r>
         <w:rPr>
-          <w:rFonts w:ascii="Calibri" w:hAnsi="Calibri" w:cs="Calibri"/>
-          <w:sz w:val="22"/>
-          <w:szCs w:val="22"/>
-        </w:rPr>
-        <w:t>Led and mentored QA teams across Equifax, UST Global, and Availity — running code reviews, owning hiring decisions, and building cultures where engineers felt ownership over quality.</w:t>
-      </w:r>
-      <w:r>
-        <w:rPr>
-          <w:rFonts w:ascii="Cambria Math" w:hAnsi="Cambria Math" w:cs="Cambria Math"/>
-          <w:sz w:val="22"/>
-          <w:szCs w:val="22"/>
-        </w:rPr>
-      </w:r>
-      <w:r>
-        <w:rPr>
-          <w:rFonts w:ascii="Calibri" w:hAnsi="Calibri" w:cs="Calibri"/>
-          <w:sz w:val="22"/>
-          <w:szCs w:val="22"/>
-        </w:rPr>
-      </w:r>
-      <w:r>
-        <w:rPr>
-          <w:rFonts w:ascii="Cambria Math" w:hAnsi="Cambria Math" w:cs="Cambria Math"/>
-          <w:sz w:val="22"/>
-          <w:szCs w:val="22"/>
-        </w:rPr>
-      </w:r>
-      <w:r>
-        <w:rPr>
-          <w:rFonts w:ascii="Calibri" w:hAnsi="Calibri" w:cs="Calibri"/>
-          <w:sz w:val="22"/>
-          <w:szCs w:val="22"/>
-        </w:rPr>
+          <w:rFonts w:ascii="Arial" w:hAnsi="Arial"/>
+          <w:b/>
+          <w:sz w:val="20"/>
+        </w:rPr>
+        <w:t>Salesforce</w:t>
+      </w:r>
+      <w:r>
+        <w:rPr>
+          <w:rFonts w:ascii="Arial" w:hAnsi="Arial"/>
+          <w:b w:val="0"/>
+          <w:sz w:val="20"/>
+        </w:rPr>
+        <w:t xml:space="preserve"> Sales Cloud and </w:t>
+      </w:r>
+      <w:r>
+        <w:rPr>
+          <w:rFonts w:ascii="Arial" w:hAnsi="Arial"/>
+          <w:b/>
+          <w:sz w:val="20"/>
+        </w:rPr>
+        <w:t>Service Cloud</w:t>
+      </w:r>
+      <w:r>
+        <w:rPr>
+          <w:rFonts w:ascii="Arial" w:hAnsi="Arial"/>
+          <w:b w:val="0"/>
+          <w:sz w:val="20"/>
+        </w:rPr>
+        <w:t xml:space="preserve"> testing, including Lightning component validation, adds a CRM dimension to a toolkit that already spans web, API, mobile, and data.</w:t>
       </w:r>
     </w:p>
     <w:p>
@@ -460,137 +1135,59 @@
       </w:pPr>
       <w:r>
         <w:rPr>
-          <w:rFonts w:ascii="Calibri" w:hAnsi="Calibri" w:cs="Calibri"/>
-          <w:sz w:val="22"/>
-          <w:szCs w:val="22"/>
-        </w:rPr>
-        <w:t>CI/CD pipeline ownership, not just participation: Jenkins, GitHub Actions, GitLab CI, and Azure DevOps pipelines I've built trigger regression, smoke, and contract tests automatically on every merge.</w:t>
-      </w:r>
-      <w:r>
-        <w:rPr>
-          <w:rFonts w:ascii="Calibri" w:hAnsi="Calibri" w:cs="Calibri"/>
-          <w:sz w:val="22"/>
-          <w:szCs w:val="22"/>
-        </w:rPr>
-      </w:r>
-      <w:r>
-        <w:rPr>
-          <w:rFonts w:ascii="Calibri" w:hAnsi="Calibri" w:cs="Calibri"/>
-          <w:sz w:val="22"/>
-          <w:szCs w:val="22"/>
-        </w:rPr>
-      </w:r>
-    </w:p>
-    <w:p>
-      <w:pPr>
-        <w:pStyle w:val="NoSpacing"/>
-        <w:numPr>
-          <w:ilvl w:val="0"/>
-          <w:numId w:val="1"/>
-        </w:numPr>
-        <w:rPr>
-          <w:rFonts w:ascii="Calibri" w:hAnsi="Calibri" w:cs="Calibri"/>
-          <w:sz w:val="22"/>
-          <w:szCs w:val="22"/>
-        </w:rPr>
-      </w:pPr>
-      <w:r>
-        <w:rPr>
-          <w:rFonts w:ascii="Calibri" w:hAnsi="Calibri" w:cs="Calibri"/>
-          <w:sz w:val="22"/>
-          <w:szCs w:val="22"/>
-        </w:rPr>
-        <w:t>Observability tools including Dynatrace, Splunk, ELK Stack, and Prometheus-Grafana dashboards help me trace failures to root cause before developers even open a ticket.</w:t>
-      </w:r>
-    </w:p>
-    <w:p>
-      <w:pPr>
-        <w:pStyle w:val="NoSpacing"/>
-        <w:numPr>
-          <w:ilvl w:val="0"/>
-          <w:numId w:val="1"/>
-        </w:numPr>
-        <w:rPr>
-          <w:rFonts w:ascii="Calibri" w:hAnsi="Calibri" w:cs="Calibri"/>
-          <w:sz w:val="22"/>
-          <w:szCs w:val="22"/>
-        </w:rPr>
-      </w:pPr>
-      <w:r>
-        <w:rPr>
-          <w:rFonts w:ascii="Calibri" w:hAnsi="Calibri" w:cs="Calibri"/>
-          <w:sz w:val="22"/>
-          <w:szCs w:val="22"/>
-        </w:rPr>
-        <w:t>BDD frameworks — Cucumber with Gherkin, Spock, and Gauge — let me write test scenarios product owners can read and engineers can execute, closing the gap between requirements and coverage.</w:t>
-      </w:r>
-    </w:p>
-    <w:p>
-      <w:pPr>
-        <w:pStyle w:val="NoSpacing"/>
-        <w:numPr>
-          <w:ilvl w:val="0"/>
-          <w:numId w:val="1"/>
-        </w:numPr>
-        <w:rPr>
-          <w:rFonts w:ascii="Calibri" w:hAnsi="Calibri" w:cs="Calibri"/>
-          <w:sz w:val="22"/>
-          <w:szCs w:val="22"/>
-        </w:rPr>
-      </w:pPr>
-      <w:r>
-        <w:rPr>
-          <w:rFonts w:ascii="Arial" w:eastAsia="Arial" w:hAnsi="Arial" w:cs="Arial"/>
-          <w:color w:val="000000"/>
-          <w:sz w:val="20"/>
-          <w:szCs w:val="20"/>
-        </w:rPr>
-        <w:t>Database validation is part of every release I own: complex SQL queries against Oracle, PostgreSQL, and MySQL catch data-integrity defects that API tests routinely miss.</w:t>
-      </w:r>
-    </w:p>
-    <w:p>
-      <w:pPr>
-        <w:pStyle w:val="NoSpacing"/>
-        <w:numPr>
-          <w:ilvl w:val="0"/>
-          <w:numId w:val="1"/>
-        </w:numPr>
-        <w:rPr>
-          <w:rFonts w:ascii="Calibri" w:hAnsi="Calibri" w:cs="Calibri"/>
-          <w:sz w:val="22"/>
-          <w:szCs w:val="22"/>
-        </w:rPr>
-      </w:pPr>
-      <w:r>
-        <w:rPr>
-          <w:rFonts w:ascii="Arial" w:eastAsia="Arial" w:hAnsi="Arial" w:cs="Arial"/>
-          <w:color w:val="000000"/>
-          <w:sz w:val="20"/>
-          <w:szCs w:val="20"/>
-        </w:rPr>
-        <w:t>Salesforce Sales Cloud and Service Cloud testing, including Lightning component validation, adds a CRM dimension to a toolkit that already spans web, API, mobile, and data.</w:t>
-      </w:r>
-    </w:p>
-    <w:p>
-      <w:pPr>
-        <w:pStyle w:val="NoSpacing"/>
-        <w:numPr>
-          <w:ilvl w:val="0"/>
-          <w:numId w:val="1"/>
-        </w:numPr>
-        <w:rPr>
-          <w:rFonts w:ascii="Calibri" w:hAnsi="Calibri" w:cs="Calibri"/>
-          <w:sz w:val="22"/>
-          <w:szCs w:val="22"/>
-        </w:rPr>
-      </w:pPr>
-      <w:r>
-        <w:rPr>
-          <w:rFonts w:ascii="Calibri" w:hAnsi="Calibri" w:cs="Calibri"/>
-          <w:sz w:val="22"/>
-          <w:szCs w:val="22"/>
-        </w:rPr>
-        <w:t>Full defect lifecycle ownership — JIRA, X-Ray, and Confluence traceability from requirement to test case to closed defect — means audits are straightforward rather than stressful.</w:t>
+          <w:rFonts w:ascii="Calibri" w:hAnsi="Calibri"/>
+          <w:b w:val="0"/>
+          <w:sz w:val="22"/>
+        </w:rPr>
+        <w:t xml:space="preserve">Full defect lifecycle ownership — </w:t>
+      </w:r>
+      <w:r>
+        <w:rPr>
+          <w:rFonts w:ascii="Calibri" w:hAnsi="Calibri"/>
+          <w:b/>
+          <w:sz w:val="22"/>
+        </w:rPr>
+        <w:t>JIRA</w:t>
+      </w:r>
+      <w:r>
+        <w:rPr>
+          <w:rFonts w:ascii="Calibri" w:hAnsi="Calibri"/>
+          <w:b w:val="0"/>
+          <w:sz w:val="22"/>
+        </w:rPr>
+        <w:t xml:space="preserve">, </w:t>
+      </w:r>
+      <w:r>
+        <w:rPr>
+          <w:rFonts w:ascii="Calibri" w:hAnsi="Calibri"/>
+          <w:b/>
+          <w:sz w:val="22"/>
+        </w:rPr>
+        <w:t>X-Ray</w:t>
+      </w:r>
+      <w:r>
+        <w:rPr>
+          <w:rFonts w:ascii="Calibri" w:hAnsi="Calibri"/>
+          <w:b w:val="0"/>
+          <w:sz w:val="22"/>
+        </w:rPr>
+        <w:t xml:space="preserve">, and </w:t>
+      </w:r>
+      <w:r>
+        <w:rPr>
+          <w:rFonts w:ascii="Calibri" w:hAnsi="Calibri"/>
+          <w:b/>
+          <w:sz w:val="22"/>
+        </w:rPr>
+        <w:t>Confluence</w:t>
+      </w:r>
+      <w:r>
+        <w:rPr>
+          <w:rFonts w:ascii="Calibri" w:hAnsi="Calibri"/>
+          <w:b w:val="0"/>
+          <w:sz w:val="22"/>
+        </w:rPr>
+        <w:t xml:space="preserve"> traceability from requirement to test case to closed defect — means audits are straightforward rather than stressful.</w:t>
       </w:r>
     </w:p>
     <w:p>
@@ -670,20 +1267,19 @@
       </w:pPr>
       <w:r>
         <w:rPr>
-          <w:rFonts w:ascii="Calibri" w:hAnsi="Calibri" w:cs="Calibri"/>
-          <w:b/>
-          <w:bCs/>
-          <w:sz w:val="22"/>
-          <w:szCs w:val="22"/>
-        </w:rPr>
-        <w:t>Languages: Java, JavaScript, TypeScript, Python, Ruby, Groovy, Go, C# (.NET), NodeJS</w:t>
-      </w:r>
-      <w:r>
-        <w:rPr>
-          <w:rFonts w:ascii="Calibri" w:hAnsi="Calibri" w:cs="Calibri"/>
-          <w:sz w:val="22"/>
-          <w:szCs w:val="22"/>
-        </w:rPr>
+          <w:rFonts w:ascii="Calibri" w:hAnsi="Calibri"/>
+          <w:b/>
+          <w:sz w:val="22"/>
+        </w:rPr>
+        <w:t>Languages:</w:t>
+      </w:r>
+      <w:r>
+        <w:rPr>
+          <w:rFonts w:ascii="Calibri" w:hAnsi="Calibri"/>
+          <w:b w:val="0"/>
+          <w:sz w:val="22"/>
+        </w:rPr>
+        <w:t xml:space="preserve"> Java, JavaScript, TypeScript, Python, Ruby, Groovy, Go, C# (.NET), NodeJS</w:t>
       </w:r>
     </w:p>
     <w:p>
@@ -699,38 +1295,23 @@
           <w:szCs w:val="22"/>
         </w:rPr>
       </w:pPr>
-      <w:r>
-        <w:rPr>
-          <w:rFonts w:ascii="Calibri" w:hAnsi="Calibri" w:cs="Calibri"/>
-          <w:b/>
-          <w:bCs/>
-          <w:sz w:val="22"/>
-          <w:szCs w:val="22"/>
-        </w:rPr>
-        <w:t>UI Automation: Playwright, Selenium WebDriver, Cypress, Appium, WebDriverIO, Perfecto</w:t>
-      </w:r>
-      <w:r>
-        <w:rPr>
-          <w:rFonts w:ascii="Calibri" w:hAnsi="Calibri" w:cs="Calibri"/>
-          <w:sz w:val="22"/>
-          <w:szCs w:val="22"/>
-        </w:rPr>
-      </w:r>
       <w:proofErr w:type="spellStart"/>
-      <w:r>
-        <w:rPr>
-          <w:rFonts w:ascii="Calibri" w:hAnsi="Calibri" w:cs="Calibri"/>
-          <w:sz w:val="22"/>
-          <w:szCs w:val="22"/>
-        </w:rPr>
-      </w:r>
       <w:proofErr w:type="spellEnd"/>
       <w:r>
         <w:rPr>
-          <w:rFonts w:ascii="Calibri" w:hAnsi="Calibri" w:cs="Calibri"/>
-          <w:sz w:val="22"/>
-          <w:szCs w:val="22"/>
-        </w:rPr>
+          <w:rFonts w:ascii="Calibri" w:hAnsi="Calibri"/>
+          <w:b/>
+          <w:sz w:val="22"/>
+        </w:rPr>
+        <w:t>UI Automation:</w:t>
+      </w:r>
+      <w:r>
+        <w:rPr>
+          <w:rFonts w:ascii="Calibri" w:hAnsi="Calibri"/>
+          <w:b w:val="0"/>
+          <w:sz w:val="22"/>
+        </w:rPr>
+        <w:t xml:space="preserve"> Playwright, Selenium WebDriver, Cypress, Appium, WebDriverIO, Perfecto</w:t>
       </w:r>
     </w:p>
     <w:p>
@@ -746,38 +1327,23 @@
           <w:szCs w:val="22"/>
         </w:rPr>
       </w:pPr>
-      <w:r>
-        <w:rPr>
-          <w:rFonts w:ascii="Calibri" w:hAnsi="Calibri" w:cs="Calibri"/>
-          <w:b/>
-          <w:bCs/>
-          <w:sz w:val="22"/>
-          <w:szCs w:val="22"/>
-        </w:rPr>
-        <w:t>API &amp; Performance: REST Assured, Karate, Postman, Bruno, Insomnia, JMeter, LoadRunner, gRPC UI</w:t>
-      </w:r>
-      <w:r>
-        <w:rPr>
-          <w:rFonts w:ascii="Calibri" w:hAnsi="Calibri" w:cs="Calibri"/>
-          <w:sz w:val="22"/>
-          <w:szCs w:val="22"/>
-        </w:rPr>
-      </w:r>
       <w:proofErr w:type="spellStart"/>
-      <w:r>
-        <w:rPr>
-          <w:rFonts w:ascii="Calibri" w:hAnsi="Calibri" w:cs="Calibri"/>
-          <w:sz w:val="22"/>
-          <w:szCs w:val="22"/>
-        </w:rPr>
-      </w:r>
       <w:proofErr w:type="spellEnd"/>
       <w:r>
         <w:rPr>
-          <w:rFonts w:ascii="Calibri" w:hAnsi="Calibri" w:cs="Calibri"/>
-          <w:sz w:val="22"/>
-          <w:szCs w:val="22"/>
-        </w:rPr>
+          <w:rFonts w:ascii="Calibri" w:hAnsi="Calibri"/>
+          <w:b/>
+          <w:sz w:val="22"/>
+        </w:rPr>
+        <w:t>API &amp; Performance:</w:t>
+      </w:r>
+      <w:r>
+        <w:rPr>
+          <w:rFonts w:ascii="Calibri" w:hAnsi="Calibri"/>
+          <w:b w:val="0"/>
+          <w:sz w:val="22"/>
+        </w:rPr>
+        <w:t xml:space="preserve"> REST Assured, Karate, Postman, Bruno, Insomnia, JMeter, LoadRunner, gRPC UI</w:t>
       </w:r>
     </w:p>
     <w:p>
@@ -795,20 +1361,19 @@
       </w:pPr>
       <w:r>
         <w:rPr>
-          <w:rFonts w:ascii="Calibri" w:hAnsi="Calibri" w:cs="Calibri"/>
-          <w:b/>
-          <w:bCs/>
-          <w:sz w:val="22"/>
-          <w:szCs w:val="22"/>
-        </w:rPr>
-        <w:t>Test Frameworks: Cucumber (Gherkin), TestNG, JUnit, Spock, Mocha, Gauge, Robot Framework</w:t>
-      </w:r>
-      <w:r>
-        <w:rPr>
-          <w:rFonts w:ascii="Calibri" w:hAnsi="Calibri" w:cs="Calibri"/>
-          <w:sz w:val="22"/>
-          <w:szCs w:val="22"/>
-        </w:rPr>
+          <w:rFonts w:ascii="Calibri" w:hAnsi="Calibri"/>
+          <w:b/>
+          <w:sz w:val="22"/>
+        </w:rPr>
+        <w:t>Test Frameworks:</w:t>
+      </w:r>
+      <w:r>
+        <w:rPr>
+          <w:rFonts w:ascii="Calibri" w:hAnsi="Calibri"/>
+          <w:b w:val="0"/>
+          <w:sz w:val="22"/>
+        </w:rPr>
+        <w:t xml:space="preserve"> Cucumber (Gherkin), TestNG, JUnit, Spock, Mocha, Gauge, Robot Framework</w:t>
       </w:r>
     </w:p>
     <w:p>
@@ -826,20 +1391,19 @@
       </w:pPr>
       <w:r>
         <w:rPr>
-          <w:rFonts w:ascii="Calibri" w:hAnsi="Calibri" w:cs="Calibri"/>
-          <w:b/>
-          <w:bCs/>
-          <w:sz w:val="22"/>
-          <w:szCs w:val="22"/>
-        </w:rPr>
-        <w:t>CI/CD &amp; Build: Jenkins, GitHub Actions, GitLab CI, Azure DevOps, Maven, Gradle, Docker, Kubernetes</w:t>
-      </w:r>
-      <w:r>
-        <w:rPr>
-          <w:rFonts w:ascii="Calibri" w:hAnsi="Calibri" w:cs="Calibri"/>
-          <w:sz w:val="22"/>
-          <w:szCs w:val="22"/>
-        </w:rPr>
+          <w:rFonts w:ascii="Calibri" w:hAnsi="Calibri"/>
+          <w:b/>
+          <w:sz w:val="22"/>
+        </w:rPr>
+        <w:t>CI/CD &amp; Build:</w:t>
+      </w:r>
+      <w:r>
+        <w:rPr>
+          <w:rFonts w:ascii="Calibri" w:hAnsi="Calibri"/>
+          <w:b w:val="0"/>
+          <w:sz w:val="22"/>
+        </w:rPr>
+        <w:t xml:space="preserve"> Jenkins, GitHub Actions, GitLab CI, Azure DevOps, Maven, Gradle, Docker, Kubernetes</w:t>
       </w:r>
     </w:p>
     <w:p>
@@ -857,20 +1421,19 @@
       </w:pPr>
       <w:r>
         <w:rPr>
-          <w:rFonts w:ascii="Calibri" w:hAnsi="Calibri" w:cs="Calibri"/>
-          <w:b/>
-          <w:bCs/>
-          <w:sz w:val="22"/>
-          <w:szCs w:val="22"/>
-        </w:rPr>
-        <w:t>Cloud: AWS (Lambda, API Gateway, S3, CloudWatch, DynamoDB), GCP, Azure (AKS, Functions, App Service)</w:t>
-      </w:r>
-      <w:r>
-        <w:rPr>
-          <w:rFonts w:ascii="Calibri" w:hAnsi="Calibri" w:cs="Calibri"/>
-          <w:sz w:val="22"/>
-          <w:szCs w:val="22"/>
-        </w:rPr>
+          <w:rFonts w:ascii="Calibri" w:hAnsi="Calibri"/>
+          <w:b/>
+          <w:sz w:val="22"/>
+        </w:rPr>
+        <w:t>Cloud:</w:t>
+      </w:r>
+      <w:r>
+        <w:rPr>
+          <w:rFonts w:ascii="Calibri" w:hAnsi="Calibri"/>
+          <w:b w:val="0"/>
+          <w:sz w:val="22"/>
+        </w:rPr>
+        <w:t xml:space="preserve"> AWS (Lambda, API Gateway, S3, CloudWatch, DynamoDB), GCP, Azure (AKS, Functions, App Service)</w:t>
       </w:r>
     </w:p>
     <w:p>
@@ -888,20 +1451,19 @@
       </w:pPr>
       <w:r>
         <w:rPr>
-          <w:rFonts w:ascii="Calibri" w:hAnsi="Calibri" w:cs="Calibri"/>
-          <w:b/>
-          <w:bCs/>
-          <w:sz w:val="22"/>
-          <w:szCs w:val="22"/>
-        </w:rPr>
-        <w:t>AI in QA: Self-healing automation, GitHub Copilot, Claude, ChatGPT, AI test generation, ML anomaly detection</w:t>
-      </w:r>
-      <w:r>
-        <w:rPr>
-          <w:rFonts w:ascii="Calibri" w:hAnsi="Calibri" w:cs="Calibri"/>
-          <w:sz w:val="22"/>
-          <w:szCs w:val="22"/>
-        </w:rPr>
+          <w:rFonts w:ascii="Calibri" w:hAnsi="Calibri"/>
+          <w:b/>
+          <w:sz w:val="22"/>
+        </w:rPr>
+        <w:t>AI in QA:</w:t>
+      </w:r>
+      <w:r>
+        <w:rPr>
+          <w:rFonts w:ascii="Calibri" w:hAnsi="Calibri"/>
+          <w:b w:val="0"/>
+          <w:sz w:val="22"/>
+        </w:rPr>
+        <w:t xml:space="preserve"> Self-healing automation, GitHub Copilot, Claude, ChatGPT, AI test generation, ML anomaly detection</w:t>
       </w:r>
     </w:p>
     <w:p>
@@ -919,20 +1481,19 @@
       </w:pPr>
       <w:r>
         <w:rPr>
-          <w:rFonts w:ascii="Calibri" w:hAnsi="Calibri" w:cs="Calibri"/>
-          <w:b/>
-          <w:bCs/>
-          <w:sz w:val="22"/>
-          <w:szCs w:val="22"/>
-        </w:rPr>
-        <w:t>Monitoring: Dynatrace, Splunk, ELK Stack, Prometheus, Grafana, CloudWatch</w:t>
-      </w:r>
-      <w:r>
-        <w:rPr>
-          <w:rFonts w:ascii="Calibri" w:hAnsi="Calibri" w:cs="Calibri"/>
-          <w:sz w:val="22"/>
-          <w:szCs w:val="22"/>
-        </w:rPr>
+          <w:rFonts w:ascii="Calibri" w:hAnsi="Calibri"/>
+          <w:b/>
+          <w:sz w:val="22"/>
+        </w:rPr>
+        <w:t>Monitoring:</w:t>
+      </w:r>
+      <w:r>
+        <w:rPr>
+          <w:rFonts w:ascii="Calibri" w:hAnsi="Calibri"/>
+          <w:b w:val="0"/>
+          <w:sz w:val="22"/>
+        </w:rPr>
+        <w:t xml:space="preserve"> Dynatrace, Splunk, ELK Stack, Prometheus, Grafana, CloudWatch</w:t>
       </w:r>
     </w:p>
     <w:p>
@@ -950,20 +1511,19 @@
       </w:pPr>
       <w:r>
         <w:rPr>
-          <w:rFonts w:ascii="Calibri" w:hAnsi="Calibri" w:cs="Calibri"/>
-          <w:b/>
-          <w:bCs/>
-          <w:sz w:val="22"/>
-          <w:szCs w:val="22"/>
-        </w:rPr>
-        <w:t>Databases: Oracle, PostgreSQL, MySQL, MongoDB, Couchbase</w:t>
-      </w:r>
-      <w:r>
-        <w:rPr>
-          <w:rFonts w:ascii="Calibri" w:hAnsi="Calibri" w:cs="Calibri"/>
-          <w:sz w:val="22"/>
-          <w:szCs w:val="22"/>
-        </w:rPr>
+          <w:rFonts w:ascii="Calibri" w:hAnsi="Calibri"/>
+          <w:b/>
+          <w:sz w:val="22"/>
+        </w:rPr>
+        <w:t>Databases:</w:t>
+      </w:r>
+      <w:r>
+        <w:rPr>
+          <w:rFonts w:ascii="Calibri" w:hAnsi="Calibri"/>
+          <w:b w:val="0"/>
+          <w:sz w:val="22"/>
+        </w:rPr>
+        <w:t xml:space="preserve"> Oracle, PostgreSQL, MySQL, MongoDB, Couchbase</w:t>
       </w:r>
     </w:p>
     <w:p>
@@ -981,20 +1541,19 @@
       </w:pPr>
       <w:r>
         <w:rPr>
-          <w:rFonts w:ascii="Calibri" w:hAnsi="Calibri" w:cs="Calibri"/>
-          <w:b/>
-          <w:bCs/>
-          <w:sz w:val="22"/>
-          <w:szCs w:val="22"/>
-        </w:rPr>
-        <w:t>CRM Platform: Salesforce (Sales Cloud, Service Cloud, Lightning Components)</w:t>
-      </w:r>
-      <w:r>
-        <w:rPr>
-          <w:rFonts w:ascii="Calibri" w:hAnsi="Calibri" w:cs="Calibri"/>
-          <w:sz w:val="22"/>
-          <w:szCs w:val="22"/>
-        </w:rPr>
+          <w:rFonts w:ascii="Calibri" w:hAnsi="Calibri"/>
+          <w:b/>
+          <w:sz w:val="22"/>
+        </w:rPr>
+        <w:t>CRM Platform:</w:t>
+      </w:r>
+      <w:r>
+        <w:rPr>
+          <w:rFonts w:ascii="Calibri" w:hAnsi="Calibri"/>
+          <w:b w:val="0"/>
+          <w:sz w:val="22"/>
+        </w:rPr>
+        <w:t xml:space="preserve"> Salesforce (Sales Cloud, Service Cloud, Lightning Components)</w:t>
       </w:r>
     </w:p>
     <w:p>
@@ -1012,20 +1571,19 @@
       </w:pPr>
       <w:r>
         <w:rPr>
-          <w:rFonts w:ascii="Calibri" w:hAnsi="Calibri" w:cs="Calibri"/>
-          <w:b/>
-          <w:bCs/>
-          <w:sz w:val="22"/>
-          <w:szCs w:val="22"/>
-        </w:rPr>
-        <w:t>Tools: JIRA, X-Ray, SonarQube, Git, GitHub, GitLab, AWS CodeCommit, IntelliJ IDEA, VS Code</w:t>
-      </w:r>
-      <w:r>
-        <w:rPr>
-          <w:rFonts w:ascii="Calibri" w:hAnsi="Calibri" w:cs="Calibri"/>
-          <w:sz w:val="22"/>
-          <w:szCs w:val="22"/>
-        </w:rPr>
+          <w:rFonts w:ascii="Calibri" w:hAnsi="Calibri"/>
+          <w:b/>
+          <w:sz w:val="22"/>
+        </w:rPr>
+        <w:t>Tools:</w:t>
+      </w:r>
+      <w:r>
+        <w:rPr>
+          <w:rFonts w:ascii="Calibri" w:hAnsi="Calibri"/>
+          <w:b w:val="0"/>
+          <w:sz w:val="22"/>
+        </w:rPr>
+        <w:t xml:space="preserve"> JIRA, X-Ray, SonarQube, Git, GitHub, GitLab, AWS CodeCommit, IntelliJ IDEA, VS Code</w:t>
       </w:r>
     </w:p>
     <w:p>
@@ -1044,62 +1602,19 @@
       </w:pPr>
       <w:r>
         <w:rPr>
-          <w:rFonts w:ascii="Calibri" w:hAnsi="Calibri" w:cs="Calibri"/>
-          <w:b/>
-          <w:bCs/>
-          <w:sz w:val="22"/>
-          <w:szCs w:val="22"/>
-          <w:lang w:val="fr-FR"/>
-        </w:rPr>
-        <w:t>Methodologies: Agile Scrum, SDLC, STLC, Defect Life Cycle, BDD, DDD, Data-Driven Testing</w:t>
-      </w:r>
-      <w:r>
-        <w:rPr>
-          <w:rFonts w:ascii="Calibri" w:hAnsi="Calibri" w:cs="Calibri"/>
-          <w:sz w:val="22"/>
-          <w:szCs w:val="22"/>
-          <w:lang w:val="fr-FR"/>
-        </w:rPr>
-      </w:r>
-      <w:r>
-        <w:rPr>
-          <w:rFonts w:ascii="Calibri" w:hAnsi="Calibri" w:cs="Calibri"/>
-          <w:sz w:val="22"/>
-          <w:szCs w:val="22"/>
-          <w:lang w:val="fr-FR"/>
-        </w:rPr>
-      </w:r>
-      <w:r>
-        <w:rPr>
-          <w:rFonts w:ascii="Calibri" w:hAnsi="Calibri" w:cs="Calibri"/>
-          <w:sz w:val="22"/>
-          <w:szCs w:val="22"/>
-          <w:lang w:val="fr-FR"/>
-        </w:rPr>
-      </w:r>
-      <w:r>
-        <w:rPr>
-          <w:rFonts w:ascii="Calibri" w:hAnsi="Calibri" w:cs="Calibri"/>
-          <w:sz w:val="22"/>
-          <w:szCs w:val="22"/>
-          <w:lang w:val="fr-FR"/>
-        </w:rPr>
-      </w:r>
-      <w:r>
-        <w:rPr>
-          <w:rFonts w:ascii="Calibri" w:hAnsi="Calibri" w:cs="Calibri"/>
-          <w:sz w:val="22"/>
-          <w:szCs w:val="22"/>
-          <w:lang w:val="fr-FR"/>
-        </w:rPr>
-      </w:r>
-      <w:r>
-        <w:rPr>
-          <w:rFonts w:ascii="Calibri" w:hAnsi="Calibri" w:cs="Calibri"/>
-          <w:sz w:val="22"/>
-          <w:szCs w:val="22"/>
-          <w:lang w:val="fr-FR"/>
-        </w:rPr>
+          <w:rFonts w:ascii="Calibri" w:hAnsi="Calibri"/>
+          <w:b/>
+          <w:sz w:val="22"/>
+        </w:rPr>
+        <w:t>Methodologies:</w:t>
+      </w:r>
+      <w:r>
+        <w:rPr>
+          <w:rFonts w:ascii="Calibri" w:hAnsi="Calibri"/>
+          <w:b w:val="0"/>
+          <w:sz w:val="22"/>
+        </w:rPr>
+        <w:t xml:space="preserve"> Agile Scrum, SDLC, STLC, Defect Life Cycle, BDD, DDD, Data-Driven Testing</w:t>
       </w:r>
     </w:p>
     <w:p>
@@ -1244,11 +1759,43 @@
       </w:pPr>
       <w:r>
         <w:rPr>
-          <w:rFonts w:ascii="Calibri" w:hAnsi="Calibri" w:cs="Calibri"/>
-          <w:sz w:val="22"/>
-          <w:szCs w:val="22"/>
-        </w:rPr>
-        <w:t>Built Toyota's enterprise Playwright and Cypress automation suite from a blank repository, covering UI, API, and microservice layers and pushing regression coverage high enough that manual pre-release sweeps became an exception rather than the rule.</w:t>
+          <w:rFonts w:ascii="Calibri" w:hAnsi="Calibri"/>
+          <w:b w:val="0"/>
+          <w:sz w:val="22"/>
+        </w:rPr>
+        <w:t xml:space="preserve">Built Toyota's enterprise </w:t>
+      </w:r>
+      <w:r>
+        <w:rPr>
+          <w:rFonts w:ascii="Calibri" w:hAnsi="Calibri"/>
+          <w:b/>
+          <w:sz w:val="22"/>
+        </w:rPr>
+        <w:t>Playwright</w:t>
+      </w:r>
+      <w:r>
+        <w:rPr>
+          <w:rFonts w:ascii="Calibri" w:hAnsi="Calibri"/>
+          <w:b w:val="0"/>
+          <w:sz w:val="22"/>
+        </w:rPr>
+        <w:t xml:space="preserve"> and </w:t>
+      </w:r>
+      <w:r>
+        <w:rPr>
+          <w:rFonts w:ascii="Calibri" w:hAnsi="Calibri"/>
+          <w:b/>
+          <w:sz w:val="22"/>
+        </w:rPr>
+        <w:t>Cypress</w:t>
+      </w:r>
+      <w:r>
+        <w:rPr>
+          <w:rFonts w:ascii="Calibri" w:hAnsi="Calibri"/>
+          <w:b w:val="0"/>
+          <w:sz w:val="22"/>
+        </w:rPr>
+        <w:t xml:space="preserve"> automation suite from a blank repository, covering UI, API, and microservice layers and pushing regression coverage high enough that manual pre-release sweeps became an exception rather than the rule.</w:t>
       </w:r>
     </w:p>
     <w:p>
@@ -1266,11 +1813,27 @@
       </w:pPr>
       <w:r>
         <w:rPr>
-          <w:rFonts w:ascii="Calibri" w:hAnsi="Calibri" w:cs="Calibri"/>
-          <w:sz w:val="22"/>
-          <w:szCs w:val="22"/>
-        </w:rPr>
-        <w:t>Designed a TypeScript-first framework architecture — page-object model, shared fixtures, environment-agnostic config — so any engineer on the team could add tests without relearning conventions from scratch.</w:t>
+          <w:rFonts w:ascii="Calibri" w:hAnsi="Calibri"/>
+          <w:b w:val="0"/>
+          <w:sz w:val="22"/>
+        </w:rPr>
+        <w:t xml:space="preserve">Designed a </w:t>
+      </w:r>
+      <w:r>
+        <w:rPr>
+          <w:rFonts w:ascii="Calibri" w:hAnsi="Calibri"/>
+          <w:b/>
+          <w:sz w:val="22"/>
+        </w:rPr>
+        <w:t>TypeScript</w:t>
+      </w:r>
+      <w:r>
+        <w:rPr>
+          <w:rFonts w:ascii="Calibri" w:hAnsi="Calibri"/>
+          <w:b w:val="0"/>
+          <w:sz w:val="22"/>
+        </w:rPr>
+        <w:t>-first framework architecture — page-object model, shared fixtures, environment-agnostic config — so any engineer on the team could add tests without relearning conventions from scratch.</w:t>
       </w:r>
     </w:p>
     <w:p>
@@ -1288,11 +1851,75 @@
       </w:pPr>
       <w:r>
         <w:rPr>
-          <w:rFonts w:ascii="Calibri" w:hAnsi="Calibri" w:cs="Calibri"/>
-          <w:sz w:val="22"/>
-          <w:szCs w:val="22"/>
-        </w:rPr>
-        <w:t>Validated cloud-native business logic across AWS Lambda, API Gateway, S3, and CloudWatch end-to-end, catching execution failures and misconfigured IAM boundaries before they surfaced in production.</w:t>
+          <w:rFonts w:ascii="Calibri" w:hAnsi="Calibri"/>
+          <w:b w:val="0"/>
+          <w:sz w:val="22"/>
+        </w:rPr>
+        <w:t xml:space="preserve">Validated cloud-native business logic across </w:t>
+      </w:r>
+      <w:r>
+        <w:rPr>
+          <w:rFonts w:ascii="Calibri" w:hAnsi="Calibri"/>
+          <w:b/>
+          <w:sz w:val="22"/>
+        </w:rPr>
+        <w:t>AWS Lambda</w:t>
+      </w:r>
+      <w:r>
+        <w:rPr>
+          <w:rFonts w:ascii="Calibri" w:hAnsi="Calibri"/>
+          <w:b w:val="0"/>
+          <w:sz w:val="22"/>
+        </w:rPr>
+        <w:t xml:space="preserve">, </w:t>
+      </w:r>
+      <w:r>
+        <w:rPr>
+          <w:rFonts w:ascii="Calibri" w:hAnsi="Calibri"/>
+          <w:b/>
+          <w:sz w:val="22"/>
+        </w:rPr>
+        <w:t>API Gateway</w:t>
+      </w:r>
+      <w:r>
+        <w:rPr>
+          <w:rFonts w:ascii="Calibri" w:hAnsi="Calibri"/>
+          <w:b w:val="0"/>
+          <w:sz w:val="22"/>
+        </w:rPr>
+        <w:t xml:space="preserve">, </w:t>
+      </w:r>
+      <w:r>
+        <w:rPr>
+          <w:rFonts w:ascii="Calibri" w:hAnsi="Calibri"/>
+          <w:b/>
+          <w:sz w:val="22"/>
+        </w:rPr>
+        <w:t>S3</w:t>
+      </w:r>
+      <w:r>
+        <w:rPr>
+          <w:rFonts w:ascii="Calibri" w:hAnsi="Calibri"/>
+          <w:b w:val="0"/>
+          <w:sz w:val="22"/>
+        </w:rPr>
+        <w:t xml:space="preserve">, and </w:t>
+      </w:r>
+      <w:r>
+        <w:rPr>
+          <w:rFonts w:ascii="Calibri" w:hAnsi="Calibri"/>
+          <w:b/>
+          <w:sz w:val="22"/>
+        </w:rPr>
+        <w:t>CloudWatch</w:t>
+      </w:r>
+      <w:r>
+        <w:rPr>
+          <w:rFonts w:ascii="Calibri" w:hAnsi="Calibri"/>
+          <w:b w:val="0"/>
+          <w:sz w:val="22"/>
+        </w:rPr>
+        <w:t xml:space="preserve"> end-to-end, catching execution failures and misconfigured IAM boundaries before they surfaced in production.</w:t>
       </w:r>
     </w:p>
     <w:p>
@@ -1310,11 +1937,59 @@
       </w:pPr>
       <w:r>
         <w:rPr>
-          <w:rFonts w:ascii="Calibri" w:hAnsi="Calibri" w:cs="Calibri"/>
-          <w:sz w:val="22"/>
-          <w:szCs w:val="22"/>
-        </w:rPr>
-        <w:t>Wrote REST Assured and Playwright API tests for every microservice boundary, embedding contract assertions directly in the GitHub Actions pipeline so a breaking schema change fails the build within minutes of the commit.</w:t>
+          <w:rFonts w:ascii="Calibri" w:hAnsi="Calibri"/>
+          <w:b w:val="0"/>
+          <w:sz w:val="22"/>
+        </w:rPr>
+        <w:t xml:space="preserve">Wrote </w:t>
+      </w:r>
+      <w:r>
+        <w:rPr>
+          <w:rFonts w:ascii="Calibri" w:hAnsi="Calibri"/>
+          <w:b/>
+          <w:sz w:val="22"/>
+        </w:rPr>
+        <w:t>REST Assured</w:t>
+      </w:r>
+      <w:r>
+        <w:rPr>
+          <w:rFonts w:ascii="Calibri" w:hAnsi="Calibri"/>
+          <w:b w:val="0"/>
+          <w:sz w:val="22"/>
+        </w:rPr>
+        <w:t xml:space="preserve"> and </w:t>
+      </w:r>
+      <w:r>
+        <w:rPr>
+          <w:rFonts w:ascii="Calibri" w:hAnsi="Calibri"/>
+          <w:b/>
+          <w:sz w:val="22"/>
+        </w:rPr>
+        <w:t>Playwright</w:t>
+      </w:r>
+      <w:r>
+        <w:rPr>
+          <w:rFonts w:ascii="Calibri" w:hAnsi="Calibri"/>
+          <w:b w:val="0"/>
+          <w:sz w:val="22"/>
+        </w:rPr>
+        <w:t xml:space="preserve"> API tests for every microservice boundary, embedding contract assertions directly in the </w:t>
+      </w:r>
+      <w:r>
+        <w:rPr>
+          <w:rFonts w:ascii="Calibri" w:hAnsi="Calibri"/>
+          <w:b/>
+          <w:sz w:val="22"/>
+        </w:rPr>
+        <w:t>GitHub Actions</w:t>
+      </w:r>
+      <w:r>
+        <w:rPr>
+          <w:rFonts w:ascii="Calibri" w:hAnsi="Calibri"/>
+          <w:b w:val="0"/>
+          <w:sz w:val="22"/>
+        </w:rPr>
+        <w:t xml:space="preserve"> pipeline so a breaking schema change fails the build within minutes of the commit.</w:t>
       </w:r>
     </w:p>
     <w:p>
@@ -1332,11 +2007,59 @@
       </w:pPr>
       <w:r>
         <w:rPr>
-          <w:rFonts w:ascii="Calibri" w:hAnsi="Calibri" w:cs="Calibri"/>
-          <w:sz w:val="22"/>
-          <w:szCs w:val="22"/>
-        </w:rPr>
-        <w:t>Integrated the full test suite into Jenkins, GitHub Actions, and Azure DevOps with quality gates that block promotion to staging when critical test thresholds drop, removing the human bottleneck from release approval.</w:t>
+          <w:rFonts w:ascii="Calibri" w:hAnsi="Calibri"/>
+          <w:b w:val="0"/>
+          <w:sz w:val="22"/>
+        </w:rPr>
+        <w:t xml:space="preserve">Integrated the full test suite into </w:t>
+      </w:r>
+      <w:r>
+        <w:rPr>
+          <w:rFonts w:ascii="Calibri" w:hAnsi="Calibri"/>
+          <w:b/>
+          <w:sz w:val="22"/>
+        </w:rPr>
+        <w:t>Jenkins</w:t>
+      </w:r>
+      <w:r>
+        <w:rPr>
+          <w:rFonts w:ascii="Calibri" w:hAnsi="Calibri"/>
+          <w:b w:val="0"/>
+          <w:sz w:val="22"/>
+        </w:rPr>
+        <w:t xml:space="preserve">, </w:t>
+      </w:r>
+      <w:r>
+        <w:rPr>
+          <w:rFonts w:ascii="Calibri" w:hAnsi="Calibri"/>
+          <w:b/>
+          <w:sz w:val="22"/>
+        </w:rPr>
+        <w:t>GitHub Actions</w:t>
+      </w:r>
+      <w:r>
+        <w:rPr>
+          <w:rFonts w:ascii="Calibri" w:hAnsi="Calibri"/>
+          <w:b w:val="0"/>
+          <w:sz w:val="22"/>
+        </w:rPr>
+        <w:t xml:space="preserve">, and </w:t>
+      </w:r>
+      <w:r>
+        <w:rPr>
+          <w:rFonts w:ascii="Calibri" w:hAnsi="Calibri"/>
+          <w:b/>
+          <w:sz w:val="22"/>
+        </w:rPr>
+        <w:t>Azure DevOps</w:t>
+      </w:r>
+      <w:r>
+        <w:rPr>
+          <w:rFonts w:ascii="Calibri" w:hAnsi="Calibri"/>
+          <w:b w:val="0"/>
+          <w:sz w:val="22"/>
+        </w:rPr>
+        <w:t xml:space="preserve"> with quality gates that block promotion to staging when critical test thresholds drop, removing the human bottleneck from release approval.</w:t>
       </w:r>
     </w:p>
     <w:p>
@@ -1398,11 +2121,43 @@
       </w:pPr>
       <w:r>
         <w:rPr>
-          <w:rFonts w:ascii="Calibri" w:hAnsi="Calibri" w:cs="Calibri"/>
-          <w:sz w:val="22"/>
-          <w:szCs w:val="22"/>
-        </w:rPr>
-        <w:t>Used GitHub Copilot and Claude to generate initial test scaffolding, edge-case scenarios, and mock API payloads, reclaiming roughly 35% of the time previously spent on boilerplate and redirecting it to exploratory testing.</w:t>
+          <w:rFonts w:ascii="Calibri" w:hAnsi="Calibri"/>
+          <w:b w:val="0"/>
+          <w:sz w:val="22"/>
+        </w:rPr>
+        <w:t xml:space="preserve">Used </w:t>
+      </w:r>
+      <w:r>
+        <w:rPr>
+          <w:rFonts w:ascii="Calibri" w:hAnsi="Calibri"/>
+          <w:b/>
+          <w:sz w:val="22"/>
+        </w:rPr>
+        <w:t>GitHub Copilot</w:t>
+      </w:r>
+      <w:r>
+        <w:rPr>
+          <w:rFonts w:ascii="Calibri" w:hAnsi="Calibri"/>
+          <w:b w:val="0"/>
+          <w:sz w:val="22"/>
+        </w:rPr>
+        <w:t xml:space="preserve"> and </w:t>
+      </w:r>
+      <w:r>
+        <w:rPr>
+          <w:rFonts w:ascii="Calibri" w:hAnsi="Calibri"/>
+          <w:b/>
+          <w:sz w:val="22"/>
+        </w:rPr>
+        <w:t>Claude</w:t>
+      </w:r>
+      <w:r>
+        <w:rPr>
+          <w:rFonts w:ascii="Calibri" w:hAnsi="Calibri"/>
+          <w:b w:val="0"/>
+          <w:sz w:val="22"/>
+        </w:rPr>
+        <w:t xml:space="preserve"> to generate initial test scaffolding, edge-case scenarios, and mock API payloads, reclaiming roughly 35% of the time previously spent on boilerplate and redirecting it to exploratory testing.</w:t>
       </w:r>
     </w:p>
     <w:p>
@@ -1420,11 +2175,27 @@
       </w:pPr>
       <w:r>
         <w:rPr>
-          <w:rFonts w:ascii="Calibri" w:hAnsi="Calibri" w:cs="Calibri"/>
-          <w:sz w:val="22"/>
-          <w:szCs w:val="22"/>
-        </w:rPr>
-        <w:t>Created complex SQL validation scripts against distributed relational backends to verify that business-rule changes propagated correctly end-to-end and that no data-integrity assumptions broke silently under new code.</w:t>
+          <w:rFonts w:ascii="Calibri" w:hAnsi="Calibri"/>
+          <w:b w:val="0"/>
+          <w:sz w:val="22"/>
+        </w:rPr>
+        <w:t xml:space="preserve">Created complex </w:t>
+      </w:r>
+      <w:r>
+        <w:rPr>
+          <w:rFonts w:ascii="Calibri" w:hAnsi="Calibri"/>
+          <w:b/>
+          <w:sz w:val="22"/>
+        </w:rPr>
+        <w:t>SQL</w:t>
+      </w:r>
+      <w:r>
+        <w:rPr>
+          <w:rFonts w:ascii="Calibri" w:hAnsi="Calibri"/>
+          <w:b w:val="0"/>
+          <w:sz w:val="22"/>
+        </w:rPr>
+        <w:t xml:space="preserve"> validation scripts against distributed relational backends to verify that business-rule changes propagated correctly end-to-end and that no data-integrity assumptions broke silently under new code.</w:t>
       </w:r>
     </w:p>
     <w:p>
@@ -1442,11 +2213,27 @@
       </w:pPr>
       <w:r>
         <w:rPr>
-          <w:rFonts w:ascii="Calibri" w:hAnsi="Calibri" w:cs="Calibri"/>
-          <w:sz w:val="22"/>
-          <w:szCs w:val="22"/>
-        </w:rPr>
-        <w:t>Built Kubernetes-aware test hooks that spin up isolated namespaces for integration tests and tear them down on completion, eliminating the shared-environment contention that was delaying parallel test runs.</w:t>
+          <w:rFonts w:ascii="Calibri" w:hAnsi="Calibri"/>
+          <w:b w:val="0"/>
+          <w:sz w:val="22"/>
+        </w:rPr>
+        <w:t xml:space="preserve">Built </w:t>
+      </w:r>
+      <w:r>
+        <w:rPr>
+          <w:rFonts w:ascii="Calibri" w:hAnsi="Calibri"/>
+          <w:b/>
+          <w:sz w:val="22"/>
+        </w:rPr>
+        <w:t>Kubernetes</w:t>
+      </w:r>
+      <w:r>
+        <w:rPr>
+          <w:rFonts w:ascii="Calibri" w:hAnsi="Calibri"/>
+          <w:b w:val="0"/>
+          <w:sz w:val="22"/>
+        </w:rPr>
+        <w:t>-aware test hooks that spin up isolated namespaces for integration tests and tear them down on completion, eliminating the shared-environment contention that was delaying parallel test runs.</w:t>
       </w:r>
     </w:p>
     <w:p>
@@ -1464,11 +2251,43 @@
       </w:pPr>
       <w:r>
         <w:rPr>
-          <w:rFonts w:ascii="Calibri" w:hAnsi="Calibri" w:cs="Calibri"/>
-          <w:sz w:val="22"/>
-          <w:szCs w:val="22"/>
-        </w:rPr>
-        <w:t>Managed full test-cycle traceability in JIRA and X-Ray — linking every requirement to test cases and every test case to a release — so stakeholders could see coverage status without asking the QA team for a status update.</w:t>
+          <w:rFonts w:ascii="Calibri" w:hAnsi="Calibri"/>
+          <w:b w:val="0"/>
+          <w:sz w:val="22"/>
+        </w:rPr>
+        <w:t xml:space="preserve">Managed full test-cycle traceability in </w:t>
+      </w:r>
+      <w:r>
+        <w:rPr>
+          <w:rFonts w:ascii="Calibri" w:hAnsi="Calibri"/>
+          <w:b/>
+          <w:sz w:val="22"/>
+        </w:rPr>
+        <w:t>JIRA</w:t>
+      </w:r>
+      <w:r>
+        <w:rPr>
+          <w:rFonts w:ascii="Calibri" w:hAnsi="Calibri"/>
+          <w:b w:val="0"/>
+          <w:sz w:val="22"/>
+        </w:rPr>
+        <w:t xml:space="preserve"> and </w:t>
+      </w:r>
+      <w:r>
+        <w:rPr>
+          <w:rFonts w:ascii="Calibri" w:hAnsi="Calibri"/>
+          <w:b/>
+          <w:sz w:val="22"/>
+        </w:rPr>
+        <w:t>X-Ray</w:t>
+      </w:r>
+      <w:r>
+        <w:rPr>
+          <w:rFonts w:ascii="Calibri" w:hAnsi="Calibri"/>
+          <w:b w:val="0"/>
+          <w:sz w:val="22"/>
+        </w:rPr>
+        <w:t xml:space="preserve"> — linking every requirement to test cases and every test case to a release — so stakeholders could see coverage status without asking the QA team for a status update.</w:t>
       </w:r>
     </w:p>
     <w:p>
@@ -1486,11 +2305,43 @@
       </w:pPr>
       <w:r>
         <w:rPr>
-          <w:rFonts w:ascii="Calibri" w:hAnsi="Calibri" w:cs="Calibri"/>
-          <w:sz w:val="22"/>
-          <w:szCs w:val="22"/>
-        </w:rPr>
-        <w:t>Led the migration of test repositories from GitHub to AWS CodeCommit, scripting the history transfer and validating branch integrity to complete the cutover with zero data loss.</w:t>
+          <w:rFonts w:ascii="Calibri" w:hAnsi="Calibri"/>
+          <w:b w:val="0"/>
+          <w:sz w:val="22"/>
+        </w:rPr>
+        <w:t xml:space="preserve">Led the migration of test repositories from </w:t>
+      </w:r>
+      <w:r>
+        <w:rPr>
+          <w:rFonts w:ascii="Calibri" w:hAnsi="Calibri"/>
+          <w:b/>
+          <w:sz w:val="22"/>
+        </w:rPr>
+        <w:t>GitHub</w:t>
+      </w:r>
+      <w:r>
+        <w:rPr>
+          <w:rFonts w:ascii="Calibri" w:hAnsi="Calibri"/>
+          <w:b w:val="0"/>
+          <w:sz w:val="22"/>
+        </w:rPr>
+        <w:t xml:space="preserve"> to </w:t>
+      </w:r>
+      <w:r>
+        <w:rPr>
+          <w:rFonts w:ascii="Calibri" w:hAnsi="Calibri"/>
+          <w:b/>
+          <w:sz w:val="22"/>
+        </w:rPr>
+        <w:t>AWS CodeCommit</w:t>
+      </w:r>
+      <w:r>
+        <w:rPr>
+          <w:rFonts w:ascii="Calibri" w:hAnsi="Calibri"/>
+          <w:b w:val="0"/>
+          <w:sz w:val="22"/>
+        </w:rPr>
+        <w:t>, scripting the history transfer and validating branch integrity to complete the cutover with zero data loss.</w:t>
       </w:r>
     </w:p>
     <w:p>
@@ -1508,12 +2359,27 @@
       </w:pPr>
       <w:r>
         <w:rPr>
-          <w:rFonts w:ascii="Calibri" w:hAnsi="Calibri" w:cs="Calibri"/>
-          <w:sz w:val="22"/>
-          <w:szCs w:val="22"/>
-          <w:lang w:val="en"/>
-        </w:rPr>
-        <w:t>Mentored four QA engineers on framework design, CI/CD integration, and cloud-testing patterns through weekly code reviews and pairing sessions, raising the team's average automation output per sprint by a measurable margin.</w:t>
+          <w:rFonts w:ascii="Calibri" w:hAnsi="Calibri"/>
+          <w:b w:val="0"/>
+          <w:sz w:val="22"/>
+        </w:rPr>
+        <w:t xml:space="preserve">Mentored four QA engineers on framework design, </w:t>
+      </w:r>
+      <w:r>
+        <w:rPr>
+          <w:rFonts w:ascii="Calibri" w:hAnsi="Calibri"/>
+          <w:b/>
+          <w:sz w:val="22"/>
+        </w:rPr>
+        <w:t>CI/CD</w:t>
+      </w:r>
+      <w:r>
+        <w:rPr>
+          <w:rFonts w:ascii="Calibri" w:hAnsi="Calibri"/>
+          <w:b w:val="0"/>
+          <w:sz w:val="22"/>
+        </w:rPr>
+        <w:t xml:space="preserve"> integration, and cloud-testing patterns through weekly code reviews and pairing sessions, raising the team's average automation output per sprint by a measurable margin.</w:t>
       </w:r>
     </w:p>
     <w:p>
@@ -1529,11 +2395,27 @@
       </w:pPr>
       <w:r>
         <w:rPr>
-          <w:rFonts w:ascii="Calibri" w:hAnsi="Calibri" w:cs="Calibri"/>
-          <w:sz w:val="22"/>
-          <w:szCs w:val="22"/>
-        </w:rPr>
-        <w:t>Collaborated with DevOps to embed Linux-based smoke tests as a mandatory post-deployment health check, catching environment-configuration defects within minutes of each release to staging.</w:t>
+          <w:rFonts w:ascii="Calibri" w:hAnsi="Calibri"/>
+          <w:b w:val="0"/>
+          <w:sz w:val="22"/>
+        </w:rPr>
+        <w:t xml:space="preserve">Collaborated with DevOps to embed </w:t>
+      </w:r>
+      <w:r>
+        <w:rPr>
+          <w:rFonts w:ascii="Calibri" w:hAnsi="Calibri"/>
+          <w:b/>
+          <w:sz w:val="22"/>
+        </w:rPr>
+        <w:t>Linux</w:t>
+      </w:r>
+      <w:r>
+        <w:rPr>
+          <w:rFonts w:ascii="Calibri" w:hAnsi="Calibri"/>
+          <w:b w:val="0"/>
+          <w:sz w:val="22"/>
+        </w:rPr>
+        <w:t>-based smoke tests as a mandatory post-deployment health check, catching environment-configuration defects within minutes of each release to staging.</w:t>
       </w:r>
     </w:p>
     <w:p>
@@ -1551,33 +2433,49 @@
       </w:pPr>
       <w:r>
         <w:rPr>
+          <w:rFonts w:ascii="Calibri" w:hAnsi="Calibri"/>
+          <w:b w:val="0"/>
+          <w:sz w:val="22"/>
+        </w:rPr>
+        <w:t xml:space="preserve">Developed </w:t>
+      </w:r>
+      <w:r>
+        <w:rPr>
+          <w:rFonts w:ascii="Calibri" w:hAnsi="Calibri"/>
+          <w:b/>
+          <w:sz w:val="22"/>
+        </w:rPr>
+        <w:t>Confluence</w:t>
+      </w:r>
+      <w:r>
+        <w:rPr>
+          <w:rFonts w:ascii="Calibri" w:hAnsi="Calibri"/>
+          <w:b w:val="0"/>
+          <w:sz w:val="22"/>
+        </w:rPr>
+        <w:t>-based test strategy documentation covering scope, risk classification, tool selection rationale, and coverage metrics, giving product and engineering leadership a clear picture of quality posture at every milestone.</w:t>
+      </w:r>
+    </w:p>
+    <w:p>
+      <w:pPr>
+        <w:pStyle w:val="ListParagraph"/>
+        <w:numPr>
+          <w:ilvl w:val="0"/>
+          <w:numId w:val="3"/>
+        </w:numPr>
+        <w:spacing w:after="0" w:line="240" w:lineRule="auto"/>
+        <w:rPr>
           <w:rFonts w:ascii="Calibri" w:eastAsia="Helvetica" w:hAnsi="Calibri" w:cs="Calibri"/>
           <w:sz w:val="22"/>
           <w:szCs w:val="22"/>
         </w:rPr>
-        <w:t>Developed Confluence-based test strategy documentation covering scope, risk classification, tool selection rationale, and coverage metrics, giving product and engineering leadership a clear picture of quality posture at every milestone.</w:t>
-      </w:r>
-    </w:p>
-    <w:p>
-      <w:pPr>
-        <w:pStyle w:val="ListParagraph"/>
-        <w:numPr>
-          <w:ilvl w:val="0"/>
-          <w:numId w:val="3"/>
-        </w:numPr>
-        <w:spacing w:after="0" w:line="240" w:lineRule="auto"/>
+      </w:pPr>
+      <w:r>
         <w:rPr>
           <w:rFonts w:ascii="Calibri" w:eastAsia="Helvetica" w:hAnsi="Calibri" w:cs="Calibri"/>
           <w:sz w:val="22"/>
           <w:szCs w:val="22"/>
         </w:rPr>
-      </w:pPr>
-      <w:r>
-        <w:rPr>
-          <w:rFonts w:ascii="Calibri" w:eastAsia="Helvetica" w:hAnsi="Calibri" w:cs="Calibri"/>
-          <w:sz w:val="22"/>
-          <w:szCs w:val="22"/>
-        </w:rPr>
         <w:t>Drove defect detection rate up 35% by designing test strategies that target boundary conditions and integration seams rather than duplicating the happy-path assertions developers already cover in unit tests.</w:t>
       </w:r>
     </w:p>
@@ -1769,11 +2667,43 @@
       </w:pPr>
       <w:r>
         <w:rPr>
-          <w:rFonts w:ascii="Calibri" w:hAnsi="Calibri" w:cs="Calibri"/>
-          <w:sz w:val="22"/>
-          <w:szCs w:val="22"/>
-        </w:rPr>
-        <w:t>Designed Equifax's Java and Selenium automation framework from zero — folder structure, base classes, driver management, and reporting hooks — replacing a fragile collection of standalone scripts with a coherent, team-maintainable system.</w:t>
+          <w:rFonts w:ascii="Calibri" w:hAnsi="Calibri"/>
+          <w:b w:val="0"/>
+          <w:sz w:val="22"/>
+        </w:rPr>
+        <w:t xml:space="preserve">Designed Equifax's </w:t>
+      </w:r>
+      <w:r>
+        <w:rPr>
+          <w:rFonts w:ascii="Calibri" w:hAnsi="Calibri"/>
+          <w:b/>
+          <w:sz w:val="22"/>
+        </w:rPr>
+        <w:t>Java</w:t>
+      </w:r>
+      <w:r>
+        <w:rPr>
+          <w:rFonts w:ascii="Calibri" w:hAnsi="Calibri"/>
+          <w:b w:val="0"/>
+          <w:sz w:val="22"/>
+        </w:rPr>
+        <w:t xml:space="preserve"> and </w:t>
+      </w:r>
+      <w:r>
+        <w:rPr>
+          <w:rFonts w:ascii="Calibri" w:hAnsi="Calibri"/>
+          <w:b/>
+          <w:sz w:val="22"/>
+        </w:rPr>
+        <w:t>Selenium</w:t>
+      </w:r>
+      <w:r>
+        <w:rPr>
+          <w:rFonts w:ascii="Calibri" w:hAnsi="Calibri"/>
+          <w:b w:val="0"/>
+          <w:sz w:val="22"/>
+        </w:rPr>
+        <w:t xml:space="preserve"> automation framework from zero — folder structure, base classes, driver management, and reporting hooks — replacing a fragile collection of standalone scripts with a coherent, team-maintainable system.</w:t>
       </w:r>
     </w:p>
     <w:p>
@@ -1791,11 +2721,75 @@
       </w:pPr>
       <w:r>
         <w:rPr>
-          <w:rFonts w:ascii="Calibri" w:hAnsi="Calibri" w:cs="Calibri"/>
-          <w:sz w:val="22"/>
-          <w:szCs w:val="22"/>
-        </w:rPr>
-        <w:t>Containerized the entire test environment using Docker and Kubernetes on AWS and GCP, so every test run started from a clean, version-locked state and environment drift stopped being a source of false failures.</w:t>
+          <w:rFonts w:ascii="Calibri" w:hAnsi="Calibri"/>
+          <w:b w:val="0"/>
+          <w:sz w:val="22"/>
+        </w:rPr>
+        <w:t xml:space="preserve">Containerized the entire test environment using </w:t>
+      </w:r>
+      <w:r>
+        <w:rPr>
+          <w:rFonts w:ascii="Calibri" w:hAnsi="Calibri"/>
+          <w:b/>
+          <w:sz w:val="22"/>
+        </w:rPr>
+        <w:t>Docker</w:t>
+      </w:r>
+      <w:r>
+        <w:rPr>
+          <w:rFonts w:ascii="Calibri" w:hAnsi="Calibri"/>
+          <w:b w:val="0"/>
+          <w:sz w:val="22"/>
+        </w:rPr>
+        <w:t xml:space="preserve"> and </w:t>
+      </w:r>
+      <w:r>
+        <w:rPr>
+          <w:rFonts w:ascii="Calibri" w:hAnsi="Calibri"/>
+          <w:b/>
+          <w:sz w:val="22"/>
+        </w:rPr>
+        <w:t>Kubernetes</w:t>
+      </w:r>
+      <w:r>
+        <w:rPr>
+          <w:rFonts w:ascii="Calibri" w:hAnsi="Calibri"/>
+          <w:b w:val="0"/>
+          <w:sz w:val="22"/>
+        </w:rPr>
+        <w:t xml:space="preserve"> on </w:t>
+      </w:r>
+      <w:r>
+        <w:rPr>
+          <w:rFonts w:ascii="Calibri" w:hAnsi="Calibri"/>
+          <w:b/>
+          <w:sz w:val="22"/>
+        </w:rPr>
+        <w:t>AWS</w:t>
+      </w:r>
+      <w:r>
+        <w:rPr>
+          <w:rFonts w:ascii="Calibri" w:hAnsi="Calibri"/>
+          <w:b w:val="0"/>
+          <w:sz w:val="22"/>
+        </w:rPr>
+        <w:t xml:space="preserve"> and </w:t>
+      </w:r>
+      <w:r>
+        <w:rPr>
+          <w:rFonts w:ascii="Calibri" w:hAnsi="Calibri"/>
+          <w:b/>
+          <w:sz w:val="22"/>
+        </w:rPr>
+        <w:t>GCP</w:t>
+      </w:r>
+      <w:r>
+        <w:rPr>
+          <w:rFonts w:ascii="Calibri" w:hAnsi="Calibri"/>
+          <w:b w:val="0"/>
+          <w:sz w:val="22"/>
+        </w:rPr>
+        <w:t>, so every test run started from a clean, version-locked state and environment drift stopped being a source of false failures.</w:t>
       </w:r>
     </w:p>
     <w:p>
@@ -1813,11 +2807,27 @@
       </w:pPr>
       <w:r>
         <w:rPr>
-          <w:rFonts w:ascii="Calibri" w:hAnsi="Calibri" w:cs="Calibri"/>
-          <w:sz w:val="22"/>
-          <w:szCs w:val="22"/>
-        </w:rPr>
-        <w:t>Built GitLab CI/CD pipelines that triggered regression and smoke suites automatically on every commit, giving developers pass-or-fail feedback before a pull request could merge rather than after deployment.</w:t>
+          <w:rFonts w:ascii="Calibri" w:hAnsi="Calibri"/>
+          <w:b w:val="0"/>
+          <w:sz w:val="22"/>
+        </w:rPr>
+        <w:t xml:space="preserve">Built </w:t>
+      </w:r>
+      <w:r>
+        <w:rPr>
+          <w:rFonts w:ascii="Calibri" w:hAnsi="Calibri"/>
+          <w:b/>
+          <w:sz w:val="22"/>
+        </w:rPr>
+        <w:t>GitLab CI</w:t>
+      </w:r>
+      <w:r>
+        <w:rPr>
+          <w:rFonts w:ascii="Calibri" w:hAnsi="Calibri"/>
+          <w:b w:val="0"/>
+          <w:sz w:val="22"/>
+        </w:rPr>
+        <w:t>/CD pipelines that triggered regression and smoke suites automatically on every commit, giving developers pass-or-fail feedback before a pull request could merge rather than after deployment.</w:t>
       </w:r>
     </w:p>
     <w:p>
@@ -1835,11 +2845,27 @@
       </w:pPr>
       <w:r>
         <w:rPr>
-          <w:rFonts w:ascii="Calibri" w:hAnsi="Calibri" w:cs="Calibri"/>
-          <w:sz w:val="22"/>
-          <w:szCs w:val="22"/>
-        </w:rPr>
-        <w:t>Ran production-scale performance tests with LoadRunner against Equifax's credit-reporting APIs, identified three specific throughput bottlenecks under concurrent load, and delivered profiling data that the backend team used to cut P95 latency meaningfully.</w:t>
+          <w:rFonts w:ascii="Calibri" w:hAnsi="Calibri"/>
+          <w:b w:val="0"/>
+          <w:sz w:val="22"/>
+        </w:rPr>
+        <w:t xml:space="preserve">Ran production-scale performance tests with </w:t>
+      </w:r>
+      <w:r>
+        <w:rPr>
+          <w:rFonts w:ascii="Calibri" w:hAnsi="Calibri"/>
+          <w:b/>
+          <w:sz w:val="22"/>
+        </w:rPr>
+        <w:t>LoadRunner</w:t>
+      </w:r>
+      <w:r>
+        <w:rPr>
+          <w:rFonts w:ascii="Calibri" w:hAnsi="Calibri"/>
+          <w:b w:val="0"/>
+          <w:sz w:val="22"/>
+        </w:rPr>
+        <w:t xml:space="preserve"> against Equifax's credit-reporting APIs, identified three specific throughput bottlenecks under concurrent load, and delivered profiling data that the backend team used to cut P95 latency meaningfully.</w:t>
       </w:r>
     </w:p>
     <w:p>
@@ -1855,29 +2881,31 @@
           <w:szCs w:val="22"/>
         </w:rPr>
       </w:pPr>
-      <w:r>
-        <w:rPr>
-          <w:rFonts w:ascii="Calibri" w:hAnsi="Calibri" w:cs="Calibri"/>
-          <w:sz w:val="22"/>
-          <w:szCs w:val="22"/>
-        </w:rPr>
-        <w:t>Grew REST Assured API test coverage across the microservice estate, writing contract tests for request schemas, error responses, and pagination behavior that caught integration regressions before they reached QA sign-off.</w:t>
-      </w:r>
       <w:proofErr w:type="gramStart"/>
-      <w:r>
-        <w:rPr>
-          <w:rFonts w:ascii="Calibri" w:hAnsi="Calibri" w:cs="Calibri"/>
-          <w:sz w:val="22"/>
-          <w:szCs w:val="22"/>
-        </w:rPr>
-      </w:r>
       <w:proofErr w:type="gramEnd"/>
       <w:r>
         <w:rPr>
-          <w:rFonts w:ascii="Calibri" w:hAnsi="Calibri" w:cs="Calibri"/>
-          <w:sz w:val="22"/>
-          <w:szCs w:val="22"/>
-        </w:rPr>
+          <w:rFonts w:ascii="Calibri" w:hAnsi="Calibri"/>
+          <w:b w:val="0"/>
+          <w:sz w:val="22"/>
+        </w:rPr>
+        <w:t xml:space="preserve">Grew </w:t>
+      </w:r>
+      <w:r>
+        <w:rPr>
+          <w:rFonts w:ascii="Calibri" w:hAnsi="Calibri"/>
+          <w:b/>
+          <w:sz w:val="22"/>
+        </w:rPr>
+        <w:t>REST Assured</w:t>
+      </w:r>
+      <w:r>
+        <w:rPr>
+          <w:rFonts w:ascii="Calibri" w:hAnsi="Calibri"/>
+          <w:b w:val="0"/>
+          <w:sz w:val="22"/>
+        </w:rPr>
+        <w:t xml:space="preserve"> API test coverage across the microservice estate, writing contract tests for request schemas, error responses, and pagination behavior that caught integration regressions before they reached QA sign-off.</w:t>
       </w:r>
     </w:p>
     <w:p>
@@ -1895,11 +2923,75 @@
       </w:pPr>
       <w:r>
         <w:rPr>
-          <w:rFonts w:ascii="Calibri" w:hAnsi="Calibri" w:cs="Calibri"/>
-          <w:sz w:val="22"/>
-          <w:szCs w:val="22"/>
-        </w:rPr>
-        <w:t>Wrote Cucumber feature files in Gherkin and paired them with Spock BDD specs, making test scenarios readable to product owners who needed to verify acceptance criteria without opening the IDE.</w:t>
+          <w:rFonts w:ascii="Calibri" w:hAnsi="Calibri"/>
+          <w:b w:val="0"/>
+          <w:sz w:val="22"/>
+        </w:rPr>
+        <w:t xml:space="preserve">Wrote </w:t>
+      </w:r>
+      <w:r>
+        <w:rPr>
+          <w:rFonts w:ascii="Calibri" w:hAnsi="Calibri"/>
+          <w:b/>
+          <w:sz w:val="22"/>
+        </w:rPr>
+        <w:t>Cucumber</w:t>
+      </w:r>
+      <w:r>
+        <w:rPr>
+          <w:rFonts w:ascii="Calibri" w:hAnsi="Calibri"/>
+          <w:b w:val="0"/>
+          <w:sz w:val="22"/>
+        </w:rPr>
+        <w:t xml:space="preserve"> feature files in </w:t>
+      </w:r>
+      <w:r>
+        <w:rPr>
+          <w:rFonts w:ascii="Calibri" w:hAnsi="Calibri"/>
+          <w:b/>
+          <w:sz w:val="22"/>
+        </w:rPr>
+        <w:t>Gherkin</w:t>
+      </w:r>
+      <w:r>
+        <w:rPr>
+          <w:rFonts w:ascii="Calibri" w:hAnsi="Calibri"/>
+          <w:b w:val="0"/>
+          <w:sz w:val="22"/>
+        </w:rPr>
+        <w:t xml:space="preserve"> and paired them with </w:t>
+      </w:r>
+      <w:r>
+        <w:rPr>
+          <w:rFonts w:ascii="Calibri" w:hAnsi="Calibri"/>
+          <w:b/>
+          <w:sz w:val="22"/>
+        </w:rPr>
+        <w:t>Spock</w:t>
+      </w:r>
+      <w:r>
+        <w:rPr>
+          <w:rFonts w:ascii="Calibri" w:hAnsi="Calibri"/>
+          <w:b w:val="0"/>
+          <w:sz w:val="22"/>
+        </w:rPr>
+        <w:t xml:space="preserve"> </w:t>
+      </w:r>
+      <w:r>
+        <w:rPr>
+          <w:rFonts w:ascii="Calibri" w:hAnsi="Calibri"/>
+          <w:b/>
+          <w:sz w:val="22"/>
+        </w:rPr>
+        <w:t>BDD</w:t>
+      </w:r>
+      <w:r>
+        <w:rPr>
+          <w:rFonts w:ascii="Calibri" w:hAnsi="Calibri"/>
+          <w:b w:val="0"/>
+          <w:sz w:val="22"/>
+        </w:rPr>
+        <w:t xml:space="preserve"> specs, making test scenarios readable to product owners who needed to verify acceptance criteria without opening the IDE.</w:t>
       </w:r>
     </w:p>
     <w:p>
@@ -1939,11 +3031,43 @@
       </w:pPr>
       <w:r>
         <w:rPr>
-          <w:rFonts w:ascii="Calibri" w:hAnsi="Calibri" w:cs="Calibri"/>
-          <w:sz w:val="22"/>
-          <w:szCs w:val="22"/>
-        </w:rPr>
-        <w:t>Integrated Dynatrace and Splunk into the test workflow so that when a test failed, engineers had correlated logs, traces, and metrics in one place instead of hunting across three dashboards to find the root cause.</w:t>
+          <w:rFonts w:ascii="Calibri" w:hAnsi="Calibri"/>
+          <w:b w:val="0"/>
+          <w:sz w:val="22"/>
+        </w:rPr>
+        <w:t xml:space="preserve">Integrated </w:t>
+      </w:r>
+      <w:r>
+        <w:rPr>
+          <w:rFonts w:ascii="Calibri" w:hAnsi="Calibri"/>
+          <w:b/>
+          <w:sz w:val="22"/>
+        </w:rPr>
+        <w:t>Dynatrace</w:t>
+      </w:r>
+      <w:r>
+        <w:rPr>
+          <w:rFonts w:ascii="Calibri" w:hAnsi="Calibri"/>
+          <w:b w:val="0"/>
+          <w:sz w:val="22"/>
+        </w:rPr>
+        <w:t xml:space="preserve"> and </w:t>
+      </w:r>
+      <w:r>
+        <w:rPr>
+          <w:rFonts w:ascii="Calibri" w:hAnsi="Calibri"/>
+          <w:b/>
+          <w:sz w:val="22"/>
+        </w:rPr>
+        <w:t>Splunk</w:t>
+      </w:r>
+      <w:r>
+        <w:rPr>
+          <w:rFonts w:ascii="Calibri" w:hAnsi="Calibri"/>
+          <w:b w:val="0"/>
+          <w:sz w:val="22"/>
+        </w:rPr>
+        <w:t xml:space="preserve"> into the test workflow so that when a test failed, engineers had correlated logs, traces, and metrics in one place instead of hunting across three dashboards to find the root cause.</w:t>
       </w:r>
     </w:p>
     <w:p>
@@ -1961,11 +3085,43 @@
       </w:pPr>
       <w:r>
         <w:rPr>
-          <w:rFonts w:ascii="Calibri" w:hAnsi="Calibri" w:cs="Calibri"/>
-          <w:sz w:val="22"/>
-          <w:szCs w:val="22"/>
-        </w:rPr>
-        <w:t>Maintained JIRA and X-Ray test plans, execution records, and defect histories with enough detail that a quarterly audit produced a clean traceability report without a last-minute documentation scramble.</w:t>
+          <w:rFonts w:ascii="Calibri" w:hAnsi="Calibri"/>
+          <w:b w:val="0"/>
+          <w:sz w:val="22"/>
+        </w:rPr>
+        <w:t xml:space="preserve">Maintained </w:t>
+      </w:r>
+      <w:r>
+        <w:rPr>
+          <w:rFonts w:ascii="Calibri" w:hAnsi="Calibri"/>
+          <w:b/>
+          <w:sz w:val="22"/>
+        </w:rPr>
+        <w:t>JIRA</w:t>
+      </w:r>
+      <w:r>
+        <w:rPr>
+          <w:rFonts w:ascii="Calibri" w:hAnsi="Calibri"/>
+          <w:b w:val="0"/>
+          <w:sz w:val="22"/>
+        </w:rPr>
+        <w:t xml:space="preserve"> and </w:t>
+      </w:r>
+      <w:r>
+        <w:rPr>
+          <w:rFonts w:ascii="Calibri" w:hAnsi="Calibri"/>
+          <w:b/>
+          <w:sz w:val="22"/>
+        </w:rPr>
+        <w:t>X-Ray</w:t>
+      </w:r>
+      <w:r>
+        <w:rPr>
+          <w:rFonts w:ascii="Calibri" w:hAnsi="Calibri"/>
+          <w:b w:val="0"/>
+          <w:sz w:val="22"/>
+        </w:rPr>
+        <w:t xml:space="preserve"> test plans, execution records, and defect histories with enough detail that a quarterly audit produced a clean traceability report without a last-minute documentation scramble.</w:t>
       </w:r>
     </w:p>
     <w:p>
@@ -1983,11 +3139,27 @@
       </w:pPr>
       <w:r>
         <w:rPr>
-          <w:rFonts w:ascii="Calibri" w:hAnsi="Calibri" w:cs="Calibri"/>
-          <w:sz w:val="22"/>
-          <w:szCs w:val="22"/>
-        </w:rPr>
-        <w:t>Validated SonarQube quality gates as part of the merge pipeline, blocking code with critical vulnerability findings or coverage regression from entering the main branch and reaching downstream test environments.</w:t>
+          <w:rFonts w:ascii="Calibri" w:hAnsi="Calibri"/>
+          <w:b w:val="0"/>
+          <w:sz w:val="22"/>
+        </w:rPr>
+        <w:t xml:space="preserve">Validated </w:t>
+      </w:r>
+      <w:r>
+        <w:rPr>
+          <w:rFonts w:ascii="Calibri" w:hAnsi="Calibri"/>
+          <w:b/>
+          <w:sz w:val="22"/>
+        </w:rPr>
+        <w:t>SonarQube</w:t>
+      </w:r>
+      <w:r>
+        <w:rPr>
+          <w:rFonts w:ascii="Calibri" w:hAnsi="Calibri"/>
+          <w:b w:val="0"/>
+          <w:sz w:val="22"/>
+        </w:rPr>
+        <w:t xml:space="preserve"> quality gates as part of the merge pipeline, blocking code with critical vulnerability findings or coverage regression from entering the main branch and reaching downstream test environments.</w:t>
       </w:r>
     </w:p>
     <w:p>
@@ -2005,11 +3177,43 @@
       </w:pPr>
       <w:r>
         <w:rPr>
-          <w:rFonts w:ascii="Calibri" w:hAnsi="Calibri" w:cs="Calibri"/>
-          <w:sz w:val="22"/>
-          <w:szCs w:val="22"/>
-        </w:rPr>
-        <w:t>Built data-driven test suites using parameterized TestNG and JUnit runners that exercised the same core workflows across dozens of input combinations, surfacing edge-case failures that single-scenario tests had been missing for months.</w:t>
+          <w:rFonts w:ascii="Calibri" w:hAnsi="Calibri"/>
+          <w:b w:val="0"/>
+          <w:sz w:val="22"/>
+        </w:rPr>
+        <w:t xml:space="preserve">Built data-driven test suites using parameterized </w:t>
+      </w:r>
+      <w:r>
+        <w:rPr>
+          <w:rFonts w:ascii="Calibri" w:hAnsi="Calibri"/>
+          <w:b/>
+          <w:sz w:val="22"/>
+        </w:rPr>
+        <w:t>TestNG</w:t>
+      </w:r>
+      <w:r>
+        <w:rPr>
+          <w:rFonts w:ascii="Calibri" w:hAnsi="Calibri"/>
+          <w:b w:val="0"/>
+          <w:sz w:val="22"/>
+        </w:rPr>
+        <w:t xml:space="preserve"> and </w:t>
+      </w:r>
+      <w:r>
+        <w:rPr>
+          <w:rFonts w:ascii="Calibri" w:hAnsi="Calibri"/>
+          <w:b/>
+          <w:sz w:val="22"/>
+        </w:rPr>
+        <w:t>JUnit</w:t>
+      </w:r>
+      <w:r>
+        <w:rPr>
+          <w:rFonts w:ascii="Calibri" w:hAnsi="Calibri"/>
+          <w:b w:val="0"/>
+          <w:sz w:val="22"/>
+        </w:rPr>
+        <w:t xml:space="preserve"> runners that exercised the same core workflows across dozens of input combinations, surfacing edge-case failures that single-scenario tests had been missing for months.</w:t>
       </w:r>
     </w:p>
     <w:p>
@@ -2027,11 +3231,27 @@
       </w:pPr>
       <w:r>
         <w:rPr>
-          <w:rFonts w:ascii="Calibri" w:hAnsi="Calibri" w:cs="Calibri"/>
-          <w:sz w:val="22"/>
-          <w:szCs w:val="22"/>
-        </w:rPr>
-        <w:t>Designed ETL and data-migration test strategies for a major data-platform initiative, writing SQL validation scripts that compared source and target record counts, field mappings, and transformation rules row by row.</w:t>
+          <w:rFonts w:ascii="Calibri" w:hAnsi="Calibri"/>
+          <w:b w:val="0"/>
+          <w:sz w:val="22"/>
+        </w:rPr>
+        <w:t xml:space="preserve">Designed ETL and data-migration test strategies for a major data-platform initiative, writing </w:t>
+      </w:r>
+      <w:r>
+        <w:rPr>
+          <w:rFonts w:ascii="Calibri" w:hAnsi="Calibri"/>
+          <w:b/>
+          <w:sz w:val="22"/>
+        </w:rPr>
+        <w:t>SQL</w:t>
+      </w:r>
+      <w:r>
+        <w:rPr>
+          <w:rFonts w:ascii="Calibri" w:hAnsi="Calibri"/>
+          <w:b w:val="0"/>
+          <w:sz w:val="22"/>
+        </w:rPr>
+        <w:t xml:space="preserve"> validation scripts that compared source and target record counts, field mappings, and transformation rules row by row.</w:t>
       </w:r>
     </w:p>
     <w:p>
@@ -2049,11 +3269,43 @@
       </w:pPr>
       <w:r>
         <w:rPr>
-          <w:rFonts w:ascii="Calibri" w:hAnsi="Calibri" w:cs="Calibri"/>
-          <w:sz w:val="22"/>
-          <w:szCs w:val="22"/>
-        </w:rPr>
-        <w:t>Developed load and stress test scenarios in JMeter to complement LoadRunner benchmarks, using both tools to cross-validate findings and build confidence in performance baselines before each major release.</w:t>
+          <w:rFonts w:ascii="Calibri" w:hAnsi="Calibri"/>
+          <w:b w:val="0"/>
+          <w:sz w:val="22"/>
+        </w:rPr>
+        <w:t xml:space="preserve">Developed load and stress test scenarios in </w:t>
+      </w:r>
+      <w:r>
+        <w:rPr>
+          <w:rFonts w:ascii="Calibri" w:hAnsi="Calibri"/>
+          <w:b/>
+          <w:sz w:val="22"/>
+        </w:rPr>
+        <w:t>JMeter</w:t>
+      </w:r>
+      <w:r>
+        <w:rPr>
+          <w:rFonts w:ascii="Calibri" w:hAnsi="Calibri"/>
+          <w:b w:val="0"/>
+          <w:sz w:val="22"/>
+        </w:rPr>
+        <w:t xml:space="preserve"> to complement </w:t>
+      </w:r>
+      <w:r>
+        <w:rPr>
+          <w:rFonts w:ascii="Calibri" w:hAnsi="Calibri"/>
+          <w:b/>
+          <w:sz w:val="22"/>
+        </w:rPr>
+        <w:t>LoadRunner</w:t>
+      </w:r>
+      <w:r>
+        <w:rPr>
+          <w:rFonts w:ascii="Calibri" w:hAnsi="Calibri"/>
+          <w:b w:val="0"/>
+          <w:sz w:val="22"/>
+        </w:rPr>
+        <w:t xml:space="preserve"> benchmarks, using both tools to cross-validate findings and build confidence in performance baselines before each major release.</w:t>
       </w:r>
     </w:p>
     <w:p>
@@ -2093,11 +3345,27 @@
       </w:pPr>
       <w:r>
         <w:rPr>
-          <w:rFonts w:ascii="Calibri" w:hAnsi="Calibri" w:cs="Calibri"/>
-          <w:sz w:val="22"/>
-          <w:szCs w:val="22"/>
-        </w:rPr>
-        <w:t>Documented framework onboarding guides, branching conventions, and pipeline runbooks in Confluence so that new engineers could contribute meaningful automation within their first two weeks rather than spending a month decoding tribal knowledge.</w:t>
+          <w:rFonts w:ascii="Calibri" w:hAnsi="Calibri"/>
+          <w:b w:val="0"/>
+          <w:sz w:val="22"/>
+        </w:rPr>
+        <w:t xml:space="preserve">Documented framework onboarding guides, branching conventions, and pipeline runbooks in </w:t>
+      </w:r>
+      <w:r>
+        <w:rPr>
+          <w:rFonts w:ascii="Calibri" w:hAnsi="Calibri"/>
+          <w:b/>
+          <w:sz w:val="22"/>
+        </w:rPr>
+        <w:t>Confluence</w:t>
+      </w:r>
+      <w:r>
+        <w:rPr>
+          <w:rFonts w:ascii="Calibri" w:hAnsi="Calibri"/>
+          <w:b w:val="0"/>
+          <w:sz w:val="22"/>
+        </w:rPr>
+        <w:t xml:space="preserve"> so that new engineers could contribute meaningful automation within their first two weeks rather than spending a month decoding tribal knowledge.</w:t>
       </w:r>
     </w:p>
     <w:p>
@@ -2219,11 +3487,43 @@
       </w:pPr>
       <w:r>
         <w:rPr>
-          <w:rFonts w:ascii="Calibri" w:hAnsi="Calibri" w:cs="Calibri"/>
-          <w:sz w:val="22"/>
-          <w:szCs w:val="22"/>
-        </w:rPr>
-        <w:t>Built Java-based automation frameworks and GitLab CI/CD pipelines from scratch so that every merge to the main branch triggered a meaningful suite of automated checks before anything moved closer to production.</w:t>
+          <w:rFonts w:ascii="Calibri" w:hAnsi="Calibri"/>
+          <w:b w:val="0"/>
+          <w:sz w:val="22"/>
+        </w:rPr>
+        <w:t xml:space="preserve">Built </w:t>
+      </w:r>
+      <w:r>
+        <w:rPr>
+          <w:rFonts w:ascii="Calibri" w:hAnsi="Calibri"/>
+          <w:b/>
+          <w:sz w:val="22"/>
+        </w:rPr>
+        <w:t>Java</w:t>
+      </w:r>
+      <w:r>
+        <w:rPr>
+          <w:rFonts w:ascii="Calibri" w:hAnsi="Calibri"/>
+          <w:b w:val="0"/>
+          <w:sz w:val="22"/>
+        </w:rPr>
+        <w:t xml:space="preserve">-based automation frameworks and </w:t>
+      </w:r>
+      <w:r>
+        <w:rPr>
+          <w:rFonts w:ascii="Calibri" w:hAnsi="Calibri"/>
+          <w:b/>
+          <w:sz w:val="22"/>
+        </w:rPr>
+        <w:t>GitLab CI</w:t>
+      </w:r>
+      <w:r>
+        <w:rPr>
+          <w:rFonts w:ascii="Calibri" w:hAnsi="Calibri"/>
+          <w:b w:val="0"/>
+          <w:sz w:val="22"/>
+        </w:rPr>
+        <w:t>/CD pipelines from scratch so that every merge to the main branch triggered a meaningful suite of automated checks before anything moved closer to production.</w:t>
       </w:r>
     </w:p>
     <w:p>
@@ -2247,10 +3547,24 @@
       </w:pPr>
       <w:r>
         <w:rPr>
-          <w:rFonts w:ascii="Calibri" w:eastAsia="Arial" w:hAnsi="Calibri" w:cs="Calibri"/>
-          <w:color w:val="000000"/>
-        </w:rPr>
-        <w:t>Implemented an Appium mobile automation framework covering Android and iOS workflows, running against an enterprise device farm that validated real-device behavior beyond what simulators alone could catch.</w:t>
+          <w:rFonts w:ascii="Calibri" w:hAnsi="Calibri"/>
+          <w:b w:val="0"/>
+        </w:rPr>
+        <w:t xml:space="preserve">Implemented an </w:t>
+      </w:r>
+      <w:r>
+        <w:rPr>
+          <w:rFonts w:ascii="Calibri" w:hAnsi="Calibri"/>
+          <w:b/>
+        </w:rPr>
+        <w:t>Appium</w:t>
+      </w:r>
+      <w:r>
+        <w:rPr>
+          <w:rFonts w:ascii="Calibri" w:hAnsi="Calibri"/>
+          <w:b w:val="0"/>
+        </w:rPr>
+        <w:t xml:space="preserve"> mobile automation framework covering Android and iOS workflows, running against an enterprise device farm that validated real-device behavior beyond what simulators alone could catch.</w:t>
       </w:r>
     </w:p>
     <w:p>
@@ -2268,12 +3582,27 @@
       </w:pPr>
       <w:r>
         <w:rPr>
-          <w:rFonts w:ascii="Calibri" w:hAnsi="Calibri" w:cs="Calibri"/>
-          <w:sz w:val="22"/>
-          <w:szCs w:val="22"/>
-          <w:lang w:val="en"/>
-        </w:rPr>
-        <w:t>Used Charles Proxy to intercept HTTP and HTTPS traffic between mobile clients and backend services, diagnosing latency issues and incorrect request construction that cut app performance problems by 65% after fixes were applied.</w:t>
+          <w:rFonts w:ascii="Calibri" w:hAnsi="Calibri"/>
+          <w:b w:val="0"/>
+          <w:sz w:val="22"/>
+        </w:rPr>
+        <w:t xml:space="preserve">Used </w:t>
+      </w:r>
+      <w:r>
+        <w:rPr>
+          <w:rFonts w:ascii="Calibri" w:hAnsi="Calibri"/>
+          <w:b/>
+          <w:sz w:val="22"/>
+        </w:rPr>
+        <w:t>Charles Proxy</w:t>
+      </w:r>
+      <w:r>
+        <w:rPr>
+          <w:rFonts w:ascii="Calibri" w:hAnsi="Calibri"/>
+          <w:b w:val="0"/>
+          <w:sz w:val="22"/>
+        </w:rPr>
+        <w:t xml:space="preserve"> to intercept HTTP and HTTPS traffic between mobile clients and backend services, diagnosing latency issues and incorrect request construction that cut app performance problems by 65% after fixes were applied.</w:t>
       </w:r>
     </w:p>
     <w:p>
@@ -2292,50 +3621,202 @@
       </w:pPr>
       <w:r>
         <w:rPr>
+          <w:rFonts w:ascii="Calibri" w:hAnsi="Calibri"/>
+          <w:b w:val="0"/>
+          <w:sz w:val="22"/>
+        </w:rPr>
+        <w:t xml:space="preserve">Developed and maintained </w:t>
+      </w:r>
+      <w:r>
+        <w:rPr>
+          <w:rFonts w:ascii="Calibri" w:hAnsi="Calibri"/>
+          <w:b/>
+          <w:sz w:val="22"/>
+        </w:rPr>
+        <w:t>Espresso</w:t>
+      </w:r>
+      <w:r>
+        <w:rPr>
+          <w:rFonts w:ascii="Calibri" w:hAnsi="Calibri"/>
+          <w:b w:val="0"/>
+          <w:sz w:val="22"/>
+        </w:rPr>
+        <w:t xml:space="preserve"> and </w:t>
+      </w:r>
+      <w:r>
+        <w:rPr>
+          <w:rFonts w:ascii="Calibri" w:hAnsi="Calibri"/>
+          <w:b/>
+          <w:sz w:val="22"/>
+        </w:rPr>
+        <w:t>XCUITest</w:t>
+      </w:r>
+      <w:r>
+        <w:rPr>
+          <w:rFonts w:ascii="Calibri" w:hAnsi="Calibri"/>
+          <w:b w:val="0"/>
+          <w:sz w:val="22"/>
+        </w:rPr>
+        <w:t xml:space="preserve"> scripts alongside </w:t>
+      </w:r>
+      <w:r>
+        <w:rPr>
+          <w:rFonts w:ascii="Calibri" w:hAnsi="Calibri"/>
+          <w:b/>
+          <w:sz w:val="22"/>
+        </w:rPr>
+        <w:t>Appium</w:t>
+      </w:r>
+      <w:r>
+        <w:rPr>
+          <w:rFonts w:ascii="Calibri" w:hAnsi="Calibri"/>
+          <w:b w:val="0"/>
+          <w:sz w:val="22"/>
+        </w:rPr>
+        <w:t>, giving the team native-layer coverage for platform-specific interactions that the cross-platform layer handled inconsistently.</w:t>
+      </w:r>
+    </w:p>
+    <w:p>
+      <w:pPr>
+        <w:pStyle w:val="ListParagraph"/>
+        <w:numPr>
+          <w:ilvl w:val="0"/>
+          <w:numId w:val="5"/>
+        </w:numPr>
+        <w:spacing w:after="0" w:line="240" w:lineRule="auto"/>
+        <w:rPr>
           <w:rFonts w:ascii="Calibri" w:eastAsia="Helvetica Neue" w:hAnsi="Calibri" w:cs="Calibri"/>
           <w:sz w:val="22"/>
           <w:szCs w:val="22"/>
         </w:rPr>
-        <w:t>Developed and maintained Espresso and XCUITest scripts alongside Appium, giving the team native-layer coverage for platform-specific interactions that the cross-platform layer handled inconsistently.</w:t>
-      </w:r>
-    </w:p>
-    <w:p>
-      <w:pPr>
-        <w:pStyle w:val="ListParagraph"/>
+      </w:pPr>
+      <w:proofErr w:type="spellStart"/>
+      <w:proofErr w:type="spellEnd"/>
+      <w:r>
+        <w:rPr>
+          <w:rFonts w:ascii="Calibri" w:hAnsi="Calibri"/>
+          <w:b w:val="0"/>
+          <w:sz w:val="22"/>
+        </w:rPr>
+        <w:t xml:space="preserve">Built </w:t>
+      </w:r>
+      <w:r>
+        <w:rPr>
+          <w:rFonts w:ascii="Calibri" w:hAnsi="Calibri"/>
+          <w:b/>
+          <w:sz w:val="22"/>
+        </w:rPr>
+        <w:t>Prometheus</w:t>
+      </w:r>
+      <w:r>
+        <w:rPr>
+          <w:rFonts w:ascii="Calibri" w:hAnsi="Calibri"/>
+          <w:b w:val="0"/>
+          <w:sz w:val="22"/>
+        </w:rPr>
+        <w:t xml:space="preserve"> and </w:t>
+      </w:r>
+      <w:r>
+        <w:rPr>
+          <w:rFonts w:ascii="Calibri" w:hAnsi="Calibri"/>
+          <w:b/>
+          <w:sz w:val="22"/>
+        </w:rPr>
+        <w:t>Grafana</w:t>
+      </w:r>
+      <w:r>
+        <w:rPr>
+          <w:rFonts w:ascii="Calibri" w:hAnsi="Calibri"/>
+          <w:b w:val="0"/>
+          <w:sz w:val="22"/>
+        </w:rPr>
+        <w:t xml:space="preserve"> dashboards tracking the four golden signals — latency, traffic, error rate, and saturation — giving the engineering team live visibility into service health during and after every release.</w:t>
+      </w:r>
+    </w:p>
+    <w:p>
+      <w:pPr>
+        <w:pStyle w:val="NoSpacing"/>
         <w:numPr>
           <w:ilvl w:val="0"/>
           <w:numId w:val="5"/>
         </w:numPr>
-        <w:spacing w:after="0" w:line="240" w:lineRule="auto"/>
-        <w:rPr>
-          <w:rFonts w:ascii="Calibri" w:eastAsia="Helvetica Neue" w:hAnsi="Calibri" w:cs="Calibri"/>
-          <w:sz w:val="22"/>
-          <w:szCs w:val="22"/>
-        </w:rPr>
-      </w:pPr>
-      <w:r>
-        <w:rPr>
-          <w:rFonts w:ascii="Calibri" w:eastAsia="Helvetica Neue" w:hAnsi="Calibri" w:cs="Calibri"/>
-          <w:sz w:val="22"/>
-          <w:szCs w:val="22"/>
-        </w:rPr>
-        <w:t>Built Prometheus and Grafana dashboards tracking the four golden signals — latency, traffic, error rate, and saturation — giving the engineering team live visibility into service health during and after every release.</w:t>
-      </w:r>
-      <w:proofErr w:type="spellStart"/>
-      <w:r>
-        <w:rPr>
-          <w:rFonts w:ascii="Calibri" w:eastAsia="Helvetica Neue" w:hAnsi="Calibri" w:cs="Calibri"/>
-          <w:sz w:val="22"/>
-          <w:szCs w:val="22"/>
-        </w:rPr>
-      </w:r>
-      <w:proofErr w:type="spellEnd"/>
-      <w:r>
-        <w:rPr>
-          <w:rFonts w:ascii="Calibri" w:eastAsia="Helvetica Neue" w:hAnsi="Calibri" w:cs="Calibri"/>
-          <w:sz w:val="22"/>
-          <w:szCs w:val="22"/>
-        </w:rPr>
+        <w:rPr>
+          <w:rFonts w:ascii="Calibri" w:hAnsi="Calibri" w:cs="Calibri"/>
+          <w:sz w:val="22"/>
+          <w:szCs w:val="22"/>
+        </w:rPr>
+      </w:pPr>
+      <w:r>
+        <w:rPr>
+          <w:rFonts w:ascii="Calibri" w:hAnsi="Calibri"/>
+          <w:b w:val="0"/>
+          <w:sz w:val="22"/>
+        </w:rPr>
+        <w:t xml:space="preserve">Debugged </w:t>
+      </w:r>
+      <w:r>
+        <w:rPr>
+          <w:rFonts w:ascii="Calibri" w:hAnsi="Calibri"/>
+          <w:b/>
+          <w:sz w:val="22"/>
+        </w:rPr>
+        <w:t>Appium</w:t>
+      </w:r>
+      <w:r>
+        <w:rPr>
+          <w:rFonts w:ascii="Calibri" w:hAnsi="Calibri"/>
+          <w:b w:val="0"/>
+          <w:sz w:val="22"/>
+        </w:rPr>
+        <w:t xml:space="preserve"> failures using </w:t>
+      </w:r>
+      <w:r>
+        <w:rPr>
+          <w:rFonts w:ascii="Calibri" w:hAnsi="Calibri"/>
+          <w:b/>
+          <w:sz w:val="22"/>
+        </w:rPr>
+        <w:t>Appium</w:t>
+      </w:r>
+      <w:r>
+        <w:rPr>
+          <w:rFonts w:ascii="Calibri" w:hAnsi="Calibri"/>
+          <w:b w:val="0"/>
+          <w:sz w:val="22"/>
+        </w:rPr>
+        <w:t xml:space="preserve"> Inspector, </w:t>
+      </w:r>
+      <w:r>
+        <w:rPr>
+          <w:rFonts w:ascii="Calibri" w:hAnsi="Calibri"/>
+          <w:b/>
+          <w:sz w:val="22"/>
+        </w:rPr>
+        <w:t>Android Studio</w:t>
+      </w:r>
+      <w:r>
+        <w:rPr>
+          <w:rFonts w:ascii="Calibri" w:hAnsi="Calibri"/>
+          <w:b w:val="0"/>
+          <w:sz w:val="22"/>
+        </w:rPr>
+        <w:t xml:space="preserve"> logcat, and </w:t>
+      </w:r>
+      <w:r>
+        <w:rPr>
+          <w:rFonts w:ascii="Calibri" w:hAnsi="Calibri"/>
+          <w:b/>
+          <w:sz w:val="22"/>
+        </w:rPr>
+        <w:t>Xcode</w:t>
+      </w:r>
+      <w:r>
+        <w:rPr>
+          <w:rFonts w:ascii="Calibri" w:hAnsi="Calibri"/>
+          <w:b w:val="0"/>
+          <w:sz w:val="22"/>
+        </w:rPr>
+        <w:t xml:space="preserve"> instruments, resolving flakiness caused by timing issues and element-synchronization gaps rather than patching them with blanket waits.</w:t>
       </w:r>
     </w:p>
     <w:p>
@@ -2353,11 +3834,59 @@
       </w:pPr>
       <w:r>
         <w:rPr>
-          <w:rFonts w:ascii="Calibri" w:hAnsi="Calibri" w:cs="Calibri"/>
-          <w:sz w:val="22"/>
-          <w:szCs w:val="22"/>
-        </w:rPr>
-        <w:t>Debugged Appium failures using Appium Inspector, Android Studio logcat, and Xcode instruments, resolving flakiness caused by timing issues and element-synchronization gaps rather than patching them with blanket waits.</w:t>
+          <w:rFonts w:ascii="Calibri" w:hAnsi="Calibri"/>
+          <w:b w:val="0"/>
+          <w:sz w:val="22"/>
+        </w:rPr>
+        <w:t xml:space="preserve">Validated </w:t>
+      </w:r>
+      <w:r>
+        <w:rPr>
+          <w:rFonts w:ascii="Calibri" w:hAnsi="Calibri"/>
+          <w:b/>
+          <w:sz w:val="22"/>
+        </w:rPr>
+        <w:t>REST</w:t>
+      </w:r>
+      <w:r>
+        <w:rPr>
+          <w:rFonts w:ascii="Calibri" w:hAnsi="Calibri"/>
+          <w:b w:val="0"/>
+          <w:sz w:val="22"/>
+        </w:rPr>
+        <w:t xml:space="preserve"> APIs using </w:t>
+      </w:r>
+      <w:r>
+        <w:rPr>
+          <w:rFonts w:ascii="Calibri" w:hAnsi="Calibri"/>
+          <w:b/>
+          <w:sz w:val="22"/>
+        </w:rPr>
+        <w:t>Postman</w:t>
+      </w:r>
+      <w:r>
+        <w:rPr>
+          <w:rFonts w:ascii="Calibri" w:hAnsi="Calibri"/>
+          <w:b w:val="0"/>
+          <w:sz w:val="22"/>
+        </w:rPr>
+        <w:t xml:space="preserve"> and </w:t>
+      </w:r>
+      <w:r>
+        <w:rPr>
+          <w:rFonts w:ascii="Calibri" w:hAnsi="Calibri"/>
+          <w:b/>
+          <w:sz w:val="22"/>
+        </w:rPr>
+        <w:t>SoapUI</w:t>
+      </w:r>
+      <w:r>
+        <w:rPr>
+          <w:rFonts w:ascii="Calibri" w:hAnsi="Calibri"/>
+          <w:b w:val="0"/>
+          <w:sz w:val="22"/>
+        </w:rPr>
+        <w:t xml:space="preserve"> across billing-platform and energy-management integrations, writing assertion scripts that checked status codes, response schemas, and business-rule correctness in a single collection run.</w:t>
       </w:r>
     </w:p>
     <w:p>
@@ -2375,11 +3904,27 @@
       </w:pPr>
       <w:r>
         <w:rPr>
-          <w:rFonts w:ascii="Calibri" w:hAnsi="Calibri" w:cs="Calibri"/>
-          <w:sz w:val="22"/>
-          <w:szCs w:val="22"/>
-        </w:rPr>
-        <w:t>Validated REST APIs using Postman and SoapUI across billing-platform and energy-management integrations, writing assertion scripts that checked status codes, response schemas, and business-rule correctness in a single collection run.</w:t>
+          <w:rFonts w:ascii="Calibri" w:hAnsi="Calibri"/>
+          <w:b w:val="0"/>
+          <w:sz w:val="22"/>
+        </w:rPr>
+        <w:t xml:space="preserve">Coordinated </w:t>
+      </w:r>
+      <w:r>
+        <w:rPr>
+          <w:rFonts w:ascii="Calibri" w:hAnsi="Calibri"/>
+          <w:b/>
+          <w:sz w:val="22"/>
+        </w:rPr>
+        <w:t>Azure DevOps</w:t>
+      </w:r>
+      <w:r>
+        <w:rPr>
+          <w:rFonts w:ascii="Calibri" w:hAnsi="Calibri"/>
+          <w:b w:val="0"/>
+          <w:sz w:val="22"/>
+        </w:rPr>
+        <w:t xml:space="preserve"> pipeline integration with the development team, embedding automated test stages as blocking gates so that deployments to staging required a passing test run rather than a verbal sign-off.</w:t>
       </w:r>
     </w:p>
     <w:p>
@@ -2397,34 +3942,59 @@
       </w:pPr>
       <w:r>
         <w:rPr>
-          <w:rFonts w:ascii="Calibri" w:hAnsi="Calibri" w:cs="Calibri"/>
-          <w:sz w:val="22"/>
-          <w:szCs w:val="22"/>
-          <w:lang w:val="en"/>
-        </w:rPr>
-        <w:t>Coordinated Azure DevOps pipeline integration with the development team, embedding automated test stages as blocking gates so that deployments to staging required a passing test run rather than a verbal sign-off.</w:t>
-      </w:r>
-    </w:p>
-    <w:p>
-      <w:pPr>
-        <w:pStyle w:val="NoSpacing"/>
-        <w:numPr>
-          <w:ilvl w:val="0"/>
-          <w:numId w:val="5"/>
-        </w:numPr>
-        <w:rPr>
-          <w:rFonts w:ascii="Calibri" w:hAnsi="Calibri" w:cs="Calibri"/>
-          <w:sz w:val="22"/>
-          <w:szCs w:val="22"/>
-        </w:rPr>
-      </w:pPr>
-      <w:r>
-        <w:rPr>
-          <w:rFonts w:ascii="Calibri" w:hAnsi="Calibri" w:cs="Calibri"/>
-          <w:sz w:val="22"/>
-          <w:szCs w:val="22"/>
-        </w:rPr>
-        <w:t>Designed test coverage for AWS Lambda functions and S3 data pipelines, writing event-driven test harnesses that simulated realistic trigger conditions and validated that outputs matched expected transformation logic.</w:t>
+          <w:rFonts w:ascii="Calibri" w:hAnsi="Calibri"/>
+          <w:b w:val="0"/>
+          <w:sz w:val="22"/>
+        </w:rPr>
+        <w:t xml:space="preserve">Designed test coverage for </w:t>
+      </w:r>
+      <w:r>
+        <w:rPr>
+          <w:rFonts w:ascii="Calibri" w:hAnsi="Calibri"/>
+          <w:b/>
+          <w:sz w:val="22"/>
+        </w:rPr>
+        <w:t>AWS Lambda</w:t>
+      </w:r>
+      <w:r>
+        <w:rPr>
+          <w:rFonts w:ascii="Calibri" w:hAnsi="Calibri"/>
+          <w:b w:val="0"/>
+          <w:sz w:val="22"/>
+        </w:rPr>
+        <w:t xml:space="preserve"> </w:t>
+      </w:r>
+      <w:r>
+        <w:rPr>
+          <w:rFonts w:ascii="Calibri" w:hAnsi="Calibri"/>
+          <w:b/>
+          <w:sz w:val="22"/>
+        </w:rPr>
+        <w:t>functions</w:t>
+      </w:r>
+      <w:r>
+        <w:rPr>
+          <w:rFonts w:ascii="Calibri" w:hAnsi="Calibri"/>
+          <w:b w:val="0"/>
+          <w:sz w:val="22"/>
+        </w:rPr>
+        <w:t xml:space="preserve"> and </w:t>
+      </w:r>
+      <w:r>
+        <w:rPr>
+          <w:rFonts w:ascii="Calibri" w:hAnsi="Calibri"/>
+          <w:b/>
+          <w:sz w:val="22"/>
+        </w:rPr>
+        <w:t>S3</w:t>
+      </w:r>
+      <w:r>
+        <w:rPr>
+          <w:rFonts w:ascii="Calibri" w:hAnsi="Calibri"/>
+          <w:b w:val="0"/>
+          <w:sz w:val="22"/>
+        </w:rPr>
+        <w:t xml:space="preserve"> data pipelines, writing event-driven test harnesses that simulated realistic trigger conditions and validated that outputs matched expected transformation logic.</w:t>
       </w:r>
     </w:p>
     <w:p>
@@ -2604,11 +4174,43 @@
       </w:pPr>
       <w:r>
         <w:rPr>
-          <w:rFonts w:ascii="Calibri" w:hAnsi="Calibri" w:cs="Calibri"/>
-          <w:sz w:val="22"/>
-          <w:szCs w:val="22"/>
-        </w:rPr>
-        <w:t>Tested healthcare workflows end-to-end — insurance eligibility checks, prior authorizations, and claim submissions — validating HL7 and EDI transaction payloads to confirm that clinical and billing data moved correctly between hospitals, payers, and providers without corruption or loss.</w:t>
+          <w:rFonts w:ascii="Calibri" w:hAnsi="Calibri"/>
+          <w:b w:val="0"/>
+          <w:sz w:val="22"/>
+        </w:rPr>
+        <w:t xml:space="preserve">Tested healthcare workflows end-to-end — insurance eligibility checks, prior authorizations, and claim submissions — validating </w:t>
+      </w:r>
+      <w:r>
+        <w:rPr>
+          <w:rFonts w:ascii="Calibri" w:hAnsi="Calibri"/>
+          <w:b/>
+          <w:sz w:val="22"/>
+        </w:rPr>
+        <w:t>HL7</w:t>
+      </w:r>
+      <w:r>
+        <w:rPr>
+          <w:rFonts w:ascii="Calibri" w:hAnsi="Calibri"/>
+          <w:b w:val="0"/>
+          <w:sz w:val="22"/>
+        </w:rPr>
+        <w:t xml:space="preserve"> and </w:t>
+      </w:r>
+      <w:r>
+        <w:rPr>
+          <w:rFonts w:ascii="Calibri" w:hAnsi="Calibri"/>
+          <w:b/>
+          <w:sz w:val="22"/>
+        </w:rPr>
+        <w:t>EDI</w:t>
+      </w:r>
+      <w:r>
+        <w:rPr>
+          <w:rFonts w:ascii="Calibri" w:hAnsi="Calibri"/>
+          <w:b w:val="0"/>
+          <w:sz w:val="22"/>
+        </w:rPr>
+        <w:t xml:space="preserve"> transaction payloads to confirm that clinical and billing data moved correctly between hospitals, payers, and providers without corruption or loss.</w:t>
       </w:r>
     </w:p>
     <w:p>
@@ -2626,11 +4228,75 @@
       </w:pPr>
       <w:r>
         <w:rPr>
-          <w:rFonts w:ascii="Calibri" w:hAnsi="Calibri" w:cs="Calibri"/>
-          <w:sz w:val="22"/>
-          <w:szCs w:val="22"/>
-        </w:rPr>
-        <w:t>Built Java, Selenium, TestNG, and Maven automation scripts that replaced the team's manual pre-release regression cycle, freeing engineers to spend their time finding new defects instead of re-running the same thirty scenarios before every deployment.</w:t>
+          <w:rFonts w:ascii="Calibri" w:hAnsi="Calibri"/>
+          <w:b w:val="0"/>
+          <w:sz w:val="22"/>
+        </w:rPr>
+        <w:t xml:space="preserve">Built </w:t>
+      </w:r>
+      <w:r>
+        <w:rPr>
+          <w:rFonts w:ascii="Calibri" w:hAnsi="Calibri"/>
+          <w:b/>
+          <w:sz w:val="22"/>
+        </w:rPr>
+        <w:t>Java</w:t>
+      </w:r>
+      <w:r>
+        <w:rPr>
+          <w:rFonts w:ascii="Calibri" w:hAnsi="Calibri"/>
+          <w:b w:val="0"/>
+          <w:sz w:val="22"/>
+        </w:rPr>
+        <w:t xml:space="preserve">, </w:t>
+      </w:r>
+      <w:r>
+        <w:rPr>
+          <w:rFonts w:ascii="Calibri" w:hAnsi="Calibri"/>
+          <w:b/>
+          <w:sz w:val="22"/>
+        </w:rPr>
+        <w:t>Selenium</w:t>
+      </w:r>
+      <w:r>
+        <w:rPr>
+          <w:rFonts w:ascii="Calibri" w:hAnsi="Calibri"/>
+          <w:b w:val="0"/>
+          <w:sz w:val="22"/>
+        </w:rPr>
+        <w:t xml:space="preserve">, </w:t>
+      </w:r>
+      <w:r>
+        <w:rPr>
+          <w:rFonts w:ascii="Calibri" w:hAnsi="Calibri"/>
+          <w:b/>
+          <w:sz w:val="22"/>
+        </w:rPr>
+        <w:t>TestNG</w:t>
+      </w:r>
+      <w:r>
+        <w:rPr>
+          <w:rFonts w:ascii="Calibri" w:hAnsi="Calibri"/>
+          <w:b w:val="0"/>
+          <w:sz w:val="22"/>
+        </w:rPr>
+        <w:t xml:space="preserve">, and </w:t>
+      </w:r>
+      <w:r>
+        <w:rPr>
+          <w:rFonts w:ascii="Calibri" w:hAnsi="Calibri"/>
+          <w:b/>
+          <w:sz w:val="22"/>
+        </w:rPr>
+        <w:t>Maven</w:t>
+      </w:r>
+      <w:r>
+        <w:rPr>
+          <w:rFonts w:ascii="Calibri" w:hAnsi="Calibri"/>
+          <w:b w:val="0"/>
+          <w:sz w:val="22"/>
+        </w:rPr>
+        <w:t xml:space="preserve"> automation scripts that replaced the team's manual pre-release regression cycle, freeing engineers to spend their time finding new defects instead of re-running the same thirty scenarios before every deployment.</w:t>
       </w:r>
     </w:p>
     <w:p>
@@ -2648,11 +4314,43 @@
       </w:pPr>
       <w:r>
         <w:rPr>
-          <w:rFonts w:ascii="Calibri" w:hAnsi="Calibri" w:cs="Calibri"/>
-          <w:sz w:val="22"/>
-          <w:szCs w:val="22"/>
-        </w:rPr>
-        <w:t>Ran JMeter and LoadRunner performance tests simulating hundreds of concurrent users against the claims-processing API, identified specific endpoints where throughput degraded under load, and delivered a prioritized findings report that developers used to target their optimization work.</w:t>
+          <w:rFonts w:ascii="Calibri" w:hAnsi="Calibri"/>
+          <w:b w:val="0"/>
+          <w:sz w:val="22"/>
+        </w:rPr>
+        <w:t xml:space="preserve">Ran </w:t>
+      </w:r>
+      <w:r>
+        <w:rPr>
+          <w:rFonts w:ascii="Calibri" w:hAnsi="Calibri"/>
+          <w:b/>
+          <w:sz w:val="22"/>
+        </w:rPr>
+        <w:t>JMeter</w:t>
+      </w:r>
+      <w:r>
+        <w:rPr>
+          <w:rFonts w:ascii="Calibri" w:hAnsi="Calibri"/>
+          <w:b w:val="0"/>
+          <w:sz w:val="22"/>
+        </w:rPr>
+        <w:t xml:space="preserve"> and </w:t>
+      </w:r>
+      <w:r>
+        <w:rPr>
+          <w:rFonts w:ascii="Calibri" w:hAnsi="Calibri"/>
+          <w:b/>
+          <w:sz w:val="22"/>
+        </w:rPr>
+        <w:t>LoadRunner</w:t>
+      </w:r>
+      <w:r>
+        <w:rPr>
+          <w:rFonts w:ascii="Calibri" w:hAnsi="Calibri"/>
+          <w:b w:val="0"/>
+          <w:sz w:val="22"/>
+        </w:rPr>
+        <w:t xml:space="preserve"> performance tests simulating hundreds of concurrent users against the claims-processing API, identified specific endpoints where throughput degraded under load, and delivered a prioritized findings report that developers used to target their optimization work.</w:t>
       </w:r>
     </w:p>
     <w:p>
@@ -2779,18 +4477,27 @@
       </w:pPr>
       <w:r>
         <w:rPr>
-          <w:rFonts w:ascii="Calibri" w:hAnsi="Calibri" w:cs="Calibri"/>
-          <w:sz w:val="22"/>
-          <w:szCs w:val="22"/>
-        </w:rPr>
-        <w:t>Wrote detailed JIRA defect reports with reproducible steps, environment details, and supporting screenshots so developers could triage and fix issues on the first attempt without back-and-forth clarification rounds.</w:t>
-      </w:r>
-      <w:r>
-        <w:rPr>
-          <w:rFonts w:ascii="Calibri" w:hAnsi="Calibri" w:cs="Calibri"/>
-          <w:sz w:val="22"/>
-          <w:szCs w:val="22"/>
-        </w:rPr>
+          <w:rFonts w:ascii="Calibri" w:hAnsi="Calibri"/>
+          <w:b w:val="0"/>
+          <w:sz w:val="22"/>
+        </w:rPr>
+        <w:t xml:space="preserve">Wrote detailed </w:t>
+      </w:r>
+      <w:r>
+        <w:rPr>
+          <w:rFonts w:ascii="Calibri" w:hAnsi="Calibri"/>
+          <w:b/>
+          <w:sz w:val="22"/>
+        </w:rPr>
+        <w:t>JIRA</w:t>
+      </w:r>
+      <w:r>
+        <w:rPr>
+          <w:rFonts w:ascii="Calibri" w:hAnsi="Calibri"/>
+          <w:b w:val="0"/>
+          <w:sz w:val="22"/>
+        </w:rPr>
+        <w:t xml:space="preserve"> defect reports with reproducible steps, environment details, and supporting screenshots so developers could triage and fix issues on the first attempt without back-and-forth clarification rounds.</w:t>
       </w:r>
     </w:p>
     <w:p>
@@ -3120,11 +4827,27 @@
       </w:pPr>
       <w:r>
         <w:rPr>
-          <w:rFonts w:ascii="Calibri" w:hAnsi="Calibri" w:cs="Calibri"/>
-          <w:sz w:val="22"/>
-          <w:szCs w:val="22"/>
-        </w:rPr>
-        <w:t>Retested resolved defects methodically and updated JIRA ticket status with evidence of passing behavior, maintaining a clean defect history that reflected actual product state rather than optimistic assumptions.</w:t>
+          <w:rFonts w:ascii="Calibri" w:hAnsi="Calibri"/>
+          <w:b w:val="0"/>
+          <w:sz w:val="22"/>
+        </w:rPr>
+        <w:t xml:space="preserve">Retested resolved defects methodically and updated </w:t>
+      </w:r>
+      <w:r>
+        <w:rPr>
+          <w:rFonts w:ascii="Calibri" w:hAnsi="Calibri"/>
+          <w:b/>
+          <w:sz w:val="22"/>
+        </w:rPr>
+        <w:t>JIRA</w:t>
+      </w:r>
+      <w:r>
+        <w:rPr>
+          <w:rFonts w:ascii="Calibri" w:hAnsi="Calibri"/>
+          <w:b w:val="0"/>
+          <w:sz w:val="22"/>
+        </w:rPr>
+        <w:t xml:space="preserve"> ticket status with evidence of passing behavior, maintaining a clean defect history that reflected actual product state rather than optimistic assumptions.</w:t>
       </w:r>
     </w:p>
     <w:p>

</xml_diff>